<commit_message>
Docs: Guia do Usuário e diagrama com check-in, recarga ativa, favoritos, perfil e tela Sobre
Co-Authored-By: Claude Opus 5.5 <noreply@anthropic.com>
Claude-Session: https://claude.ai/code/session_01TW1SifSUPb9kTwyp6u2Fvv
</commit_message>
<xml_diff>
--- a/docs/Guia_do_Usuario_VoltMap_v0.1.docx
+++ b/docs/Guia_do_Usuario_VoltMap_v0.1.docx
@@ -64,7 +64,7 @@
         <w:spacing w:after="1200"/>
         <w:jc w:val="center"/>
       </w:pPr>
-      <w:hyperlink w:history="1" r:id="rIdpjmvoxxn1c26wdjytnpp4">
+      <w:hyperlink w:history="1" r:id="rIdyevmpyavkjpwtz1jwywtw">
         <w:r>
           <w:rPr>
             <w:rStyle w:val="Hyperlink"/>
@@ -431,7 +431,7 @@
                 <w:sz w:val="20"/>
                 <w:szCs w:val="20"/>
               </w:rPr>
-              <w:t xml:space="preserve">4 e 9</w:t>
+              <w:t xml:space="preserve">4 e 14</w:t>
             </w:r>
           </w:p>
         </w:tc>
@@ -862,6 +862,436 @@
                 <w:szCs w:val="20"/>
               </w:rPr>
               <w:t xml:space="preserve">8</w:t>
+            </w:r>
+          </w:p>
+        </w:tc>
+      </w:tr>
+      <w:tr>
+        <w:tc>
+          <w:tcPr>
+            <w:tcW w:type="dxa" w:w="5638"/>
+            <w:tcBorders>
+              <w:top w:val="single" w:color="D1D5DB" w:sz="4"/>
+              <w:left w:val="single" w:color="D1D5DB" w:sz="4"/>
+              <w:bottom w:val="single" w:color="D1D5DB" w:sz="4"/>
+              <w:right w:val="single" w:color="D1D5DB" w:sz="4"/>
+            </w:tcBorders>
+            <w:tcMar>
+              <w:top w:type="dxa" w:w="80"/>
+              <w:left w:type="dxa" w:w="120"/>
+              <w:bottom w:type="dxa" w:w="80"/>
+              <w:right w:type="dxa" w:w="120"/>
+            </w:tcMar>
+          </w:tcPr>
+          <w:p>
+            <w:r>
+              <w:rPr>
+                <w:b w:val="false"/>
+                <w:bCs w:val="false"/>
+                <w:sz w:val="20"/>
+                <w:szCs w:val="20"/>
+              </w:rPr>
+              <w:t xml:space="preserve">Fazer check-in (informar se o ponto está disponível, ocupado ou fora de serviço)</w:t>
+            </w:r>
+          </w:p>
+        </w:tc>
+        <w:tc>
+          <w:tcPr>
+            <w:tcW w:type="dxa" w:w="2000"/>
+            <w:tcBorders>
+              <w:top w:val="single" w:color="D1D5DB" w:sz="4"/>
+              <w:left w:val="single" w:color="D1D5DB" w:sz="4"/>
+              <w:bottom w:val="single" w:color="D1D5DB" w:sz="4"/>
+              <w:right w:val="single" w:color="D1D5DB" w:sz="4"/>
+            </w:tcBorders>
+            <w:tcMar>
+              <w:top w:type="dxa" w:w="80"/>
+              <w:left w:type="dxa" w:w="120"/>
+              <w:bottom w:type="dxa" w:w="80"/>
+              <w:right w:type="dxa" w:w="120"/>
+            </w:tcMar>
+          </w:tcPr>
+          <w:p>
+            <w:r>
+              <w:rPr>
+                <w:b w:val="false"/>
+                <w:bCs w:val="false"/>
+                <w:sz w:val="20"/>
+                <w:szCs w:val="20"/>
+              </w:rPr>
+              <w:t xml:space="preserve">Sim</w:t>
+            </w:r>
+          </w:p>
+        </w:tc>
+        <w:tc>
+          <w:tcPr>
+            <w:tcW w:type="dxa" w:w="2000"/>
+            <w:tcBorders>
+              <w:top w:val="single" w:color="D1D5DB" w:sz="4"/>
+              <w:left w:val="single" w:color="D1D5DB" w:sz="4"/>
+              <w:bottom w:val="single" w:color="D1D5DB" w:sz="4"/>
+              <w:right w:val="single" w:color="D1D5DB" w:sz="4"/>
+            </w:tcBorders>
+            <w:tcMar>
+              <w:top w:type="dxa" w:w="80"/>
+              <w:left w:type="dxa" w:w="120"/>
+              <w:bottom w:type="dxa" w:w="80"/>
+              <w:right w:type="dxa" w:w="120"/>
+            </w:tcMar>
+          </w:tcPr>
+          <w:p>
+            <w:r>
+              <w:rPr>
+                <w:b w:val="false"/>
+                <w:bCs w:val="false"/>
+                <w:sz w:val="20"/>
+                <w:szCs w:val="20"/>
+              </w:rPr>
+              <w:t xml:space="preserve">9</w:t>
+            </w:r>
+          </w:p>
+        </w:tc>
+      </w:tr>
+      <w:tr>
+        <w:tc>
+          <w:tcPr>
+            <w:tcW w:type="dxa" w:w="5638"/>
+            <w:tcBorders>
+              <w:top w:val="single" w:color="D1D5DB" w:sz="4"/>
+              <w:left w:val="single" w:color="D1D5DB" w:sz="4"/>
+              <w:bottom w:val="single" w:color="D1D5DB" w:sz="4"/>
+              <w:right w:val="single" w:color="D1D5DB" w:sz="4"/>
+            </w:tcBorders>
+            <w:tcMar>
+              <w:top w:type="dxa" w:w="80"/>
+              <w:left w:type="dxa" w:w="120"/>
+              <w:bottom w:type="dxa" w:w="80"/>
+              <w:right w:type="dxa" w:w="120"/>
+            </w:tcMar>
+          </w:tcPr>
+          <w:p>
+            <w:r>
+              <w:rPr>
+                <w:b w:val="false"/>
+                <w:bCs w:val="false"/>
+                <w:sz w:val="20"/>
+                <w:szCs w:val="20"/>
+              </w:rPr>
+              <w:t xml:space="preserve">Iniciar e encerrar uma recarga (recarga ativa)</w:t>
+            </w:r>
+          </w:p>
+        </w:tc>
+        <w:tc>
+          <w:tcPr>
+            <w:tcW w:type="dxa" w:w="2000"/>
+            <w:tcBorders>
+              <w:top w:val="single" w:color="D1D5DB" w:sz="4"/>
+              <w:left w:val="single" w:color="D1D5DB" w:sz="4"/>
+              <w:bottom w:val="single" w:color="D1D5DB" w:sz="4"/>
+              <w:right w:val="single" w:color="D1D5DB" w:sz="4"/>
+            </w:tcBorders>
+            <w:tcMar>
+              <w:top w:type="dxa" w:w="80"/>
+              <w:left w:type="dxa" w:w="120"/>
+              <w:bottom w:type="dxa" w:w="80"/>
+              <w:right w:type="dxa" w:w="120"/>
+            </w:tcMar>
+          </w:tcPr>
+          <w:p>
+            <w:r>
+              <w:rPr>
+                <w:b w:val="false"/>
+                <w:bCs w:val="false"/>
+                <w:sz w:val="20"/>
+                <w:szCs w:val="20"/>
+              </w:rPr>
+              <w:t xml:space="preserve">Sim</w:t>
+            </w:r>
+          </w:p>
+        </w:tc>
+        <w:tc>
+          <w:tcPr>
+            <w:tcW w:type="dxa" w:w="2000"/>
+            <w:tcBorders>
+              <w:top w:val="single" w:color="D1D5DB" w:sz="4"/>
+              <w:left w:val="single" w:color="D1D5DB" w:sz="4"/>
+              <w:bottom w:val="single" w:color="D1D5DB" w:sz="4"/>
+              <w:right w:val="single" w:color="D1D5DB" w:sz="4"/>
+            </w:tcBorders>
+            <w:tcMar>
+              <w:top w:type="dxa" w:w="80"/>
+              <w:left w:type="dxa" w:w="120"/>
+              <w:bottom w:type="dxa" w:w="80"/>
+              <w:right w:type="dxa" w:w="120"/>
+            </w:tcMar>
+          </w:tcPr>
+          <w:p>
+            <w:r>
+              <w:rPr>
+                <w:b w:val="false"/>
+                <w:bCs w:val="false"/>
+                <w:sz w:val="20"/>
+                <w:szCs w:val="20"/>
+              </w:rPr>
+              <w:t xml:space="preserve">10</w:t>
+            </w:r>
+          </w:p>
+        </w:tc>
+      </w:tr>
+      <w:tr>
+        <w:tc>
+          <w:tcPr>
+            <w:tcW w:type="dxa" w:w="5638"/>
+            <w:tcBorders>
+              <w:top w:val="single" w:color="D1D5DB" w:sz="4"/>
+              <w:left w:val="single" w:color="D1D5DB" w:sz="4"/>
+              <w:bottom w:val="single" w:color="D1D5DB" w:sz="4"/>
+              <w:right w:val="single" w:color="D1D5DB" w:sz="4"/>
+            </w:tcBorders>
+            <w:tcMar>
+              <w:top w:type="dxa" w:w="80"/>
+              <w:left w:type="dxa" w:w="120"/>
+              <w:bottom w:type="dxa" w:w="80"/>
+              <w:right w:type="dxa" w:w="120"/>
+            </w:tcMar>
+          </w:tcPr>
+          <w:p>
+            <w:r>
+              <w:rPr>
+                <w:b w:val="false"/>
+                <w:bCs w:val="false"/>
+                <w:sz w:val="20"/>
+                <w:szCs w:val="20"/>
+              </w:rPr>
+              <w:t xml:space="preserve">Favoritar pontos de recarga</w:t>
+            </w:r>
+          </w:p>
+        </w:tc>
+        <w:tc>
+          <w:tcPr>
+            <w:tcW w:type="dxa" w:w="2000"/>
+            <w:tcBorders>
+              <w:top w:val="single" w:color="D1D5DB" w:sz="4"/>
+              <w:left w:val="single" w:color="D1D5DB" w:sz="4"/>
+              <w:bottom w:val="single" w:color="D1D5DB" w:sz="4"/>
+              <w:right w:val="single" w:color="D1D5DB" w:sz="4"/>
+            </w:tcBorders>
+            <w:tcMar>
+              <w:top w:type="dxa" w:w="80"/>
+              <w:left w:type="dxa" w:w="120"/>
+              <w:bottom w:type="dxa" w:w="80"/>
+              <w:right w:type="dxa" w:w="120"/>
+            </w:tcMar>
+          </w:tcPr>
+          <w:p>
+            <w:r>
+              <w:rPr>
+                <w:b w:val="false"/>
+                <w:bCs w:val="false"/>
+                <w:sz w:val="20"/>
+                <w:szCs w:val="20"/>
+              </w:rPr>
+              <w:t xml:space="preserve">Sim</w:t>
+            </w:r>
+          </w:p>
+        </w:tc>
+        <w:tc>
+          <w:tcPr>
+            <w:tcW w:type="dxa" w:w="2000"/>
+            <w:tcBorders>
+              <w:top w:val="single" w:color="D1D5DB" w:sz="4"/>
+              <w:left w:val="single" w:color="D1D5DB" w:sz="4"/>
+              <w:bottom w:val="single" w:color="D1D5DB" w:sz="4"/>
+              <w:right w:val="single" w:color="D1D5DB" w:sz="4"/>
+            </w:tcBorders>
+            <w:tcMar>
+              <w:top w:type="dxa" w:w="80"/>
+              <w:left w:type="dxa" w:w="120"/>
+              <w:bottom w:type="dxa" w:w="80"/>
+              <w:right w:type="dxa" w:w="120"/>
+            </w:tcMar>
+          </w:tcPr>
+          <w:p>
+            <w:r>
+              <w:rPr>
+                <w:b w:val="false"/>
+                <w:bCs w:val="false"/>
+                <w:sz w:val="20"/>
+                <w:szCs w:val="20"/>
+              </w:rPr>
+              <w:t xml:space="preserve">11</w:t>
+            </w:r>
+          </w:p>
+        </w:tc>
+      </w:tr>
+      <w:tr>
+        <w:tc>
+          <w:tcPr>
+            <w:tcW w:type="dxa" w:w="5638"/>
+            <w:tcBorders>
+              <w:top w:val="single" w:color="D1D5DB" w:sz="4"/>
+              <w:left w:val="single" w:color="D1D5DB" w:sz="4"/>
+              <w:bottom w:val="single" w:color="D1D5DB" w:sz="4"/>
+              <w:right w:val="single" w:color="D1D5DB" w:sz="4"/>
+            </w:tcBorders>
+            <w:tcMar>
+              <w:top w:type="dxa" w:w="80"/>
+              <w:left w:type="dxa" w:w="120"/>
+              <w:bottom w:type="dxa" w:w="80"/>
+              <w:right w:type="dxa" w:w="120"/>
+            </w:tcMar>
+          </w:tcPr>
+          <w:p>
+            <w:r>
+              <w:rPr>
+                <w:b w:val="false"/>
+                <w:bCs w:val="false"/>
+                <w:sz w:val="20"/>
+                <w:szCs w:val="20"/>
+              </w:rPr>
+              <w:t xml:space="preserve">Meu perfil: dados, senha, favoritos, pontos cadastrados e check-ins</w:t>
+            </w:r>
+          </w:p>
+        </w:tc>
+        <w:tc>
+          <w:tcPr>
+            <w:tcW w:type="dxa" w:w="2000"/>
+            <w:tcBorders>
+              <w:top w:val="single" w:color="D1D5DB" w:sz="4"/>
+              <w:left w:val="single" w:color="D1D5DB" w:sz="4"/>
+              <w:bottom w:val="single" w:color="D1D5DB" w:sz="4"/>
+              <w:right w:val="single" w:color="D1D5DB" w:sz="4"/>
+            </w:tcBorders>
+            <w:tcMar>
+              <w:top w:type="dxa" w:w="80"/>
+              <w:left w:type="dxa" w:w="120"/>
+              <w:bottom w:type="dxa" w:w="80"/>
+              <w:right w:type="dxa" w:w="120"/>
+            </w:tcMar>
+          </w:tcPr>
+          <w:p>
+            <w:r>
+              <w:rPr>
+                <w:b w:val="false"/>
+                <w:bCs w:val="false"/>
+                <w:sz w:val="20"/>
+                <w:szCs w:val="20"/>
+              </w:rPr>
+              <w:t xml:space="preserve">Sim</w:t>
+            </w:r>
+          </w:p>
+        </w:tc>
+        <w:tc>
+          <w:tcPr>
+            <w:tcW w:type="dxa" w:w="2000"/>
+            <w:tcBorders>
+              <w:top w:val="single" w:color="D1D5DB" w:sz="4"/>
+              <w:left w:val="single" w:color="D1D5DB" w:sz="4"/>
+              <w:bottom w:val="single" w:color="D1D5DB" w:sz="4"/>
+              <w:right w:val="single" w:color="D1D5DB" w:sz="4"/>
+            </w:tcBorders>
+            <w:tcMar>
+              <w:top w:type="dxa" w:w="80"/>
+              <w:left w:type="dxa" w:w="120"/>
+              <w:bottom w:type="dxa" w:w="80"/>
+              <w:right w:type="dxa" w:w="120"/>
+            </w:tcMar>
+          </w:tcPr>
+          <w:p>
+            <w:r>
+              <w:rPr>
+                <w:b w:val="false"/>
+                <w:bCs w:val="false"/>
+                <w:sz w:val="20"/>
+                <w:szCs w:val="20"/>
+              </w:rPr>
+              <w:t xml:space="preserve">12</w:t>
+            </w:r>
+          </w:p>
+        </w:tc>
+      </w:tr>
+      <w:tr>
+        <w:tc>
+          <w:tcPr>
+            <w:tcW w:type="dxa" w:w="5638"/>
+            <w:tcBorders>
+              <w:top w:val="single" w:color="D1D5DB" w:sz="4"/>
+              <w:left w:val="single" w:color="D1D5DB" w:sz="4"/>
+              <w:bottom w:val="single" w:color="D1D5DB" w:sz="4"/>
+              <w:right w:val="single" w:color="D1D5DB" w:sz="4"/>
+            </w:tcBorders>
+            <w:tcMar>
+              <w:top w:type="dxa" w:w="80"/>
+              <w:left w:type="dxa" w:w="120"/>
+              <w:bottom w:type="dxa" w:w="80"/>
+              <w:right w:type="dxa" w:w="120"/>
+            </w:tcMar>
+          </w:tcPr>
+          <w:p>
+            <w:r>
+              <w:rPr>
+                <w:b w:val="false"/>
+                <w:bCs w:val="false"/>
+                <w:sz w:val="20"/>
+                <w:szCs w:val="20"/>
+              </w:rPr>
+              <w:t xml:space="preserve">Sobre o VoltMap: versão publicada e histórico de versões</w:t>
+            </w:r>
+          </w:p>
+        </w:tc>
+        <w:tc>
+          <w:tcPr>
+            <w:tcW w:type="dxa" w:w="2000"/>
+            <w:tcBorders>
+              <w:top w:val="single" w:color="D1D5DB" w:sz="4"/>
+              <w:left w:val="single" w:color="D1D5DB" w:sz="4"/>
+              <w:bottom w:val="single" w:color="D1D5DB" w:sz="4"/>
+              <w:right w:val="single" w:color="D1D5DB" w:sz="4"/>
+            </w:tcBorders>
+            <w:tcMar>
+              <w:top w:type="dxa" w:w="80"/>
+              <w:left w:type="dxa" w:w="120"/>
+              <w:bottom w:type="dxa" w:w="80"/>
+              <w:right w:type="dxa" w:w="120"/>
+            </w:tcMar>
+          </w:tcPr>
+          <w:p>
+            <w:r>
+              <w:rPr>
+                <w:b w:val="false"/>
+                <w:bCs w:val="false"/>
+                <w:sz w:val="20"/>
+                <w:szCs w:val="20"/>
+              </w:rPr>
+              <w:t xml:space="preserve">Não</w:t>
+            </w:r>
+          </w:p>
+        </w:tc>
+        <w:tc>
+          <w:tcPr>
+            <w:tcW w:type="dxa" w:w="2000"/>
+            <w:tcBorders>
+              <w:top w:val="single" w:color="D1D5DB" w:sz="4"/>
+              <w:left w:val="single" w:color="D1D5DB" w:sz="4"/>
+              <w:bottom w:val="single" w:color="D1D5DB" w:sz="4"/>
+              <w:right w:val="single" w:color="D1D5DB" w:sz="4"/>
+            </w:tcBorders>
+            <w:tcMar>
+              <w:top w:type="dxa" w:w="80"/>
+              <w:left w:type="dxa" w:w="120"/>
+              <w:bottom w:type="dxa" w:w="80"/>
+              <w:right w:type="dxa" w:w="120"/>
+            </w:tcMar>
+          </w:tcPr>
+          <w:p>
+            <w:r>
+              <w:rPr>
+                <w:b w:val="false"/>
+                <w:bCs w:val="false"/>
+                <w:sz w:val="20"/>
+                <w:szCs w:val="20"/>
+              </w:rPr>
+              <w:t xml:space="preserve">13</w:t>
             </w:r>
           </w:p>
         </w:tc>
@@ -900,7 +1330,7 @@
       <w:r>
         <w:t xml:space="preserve">Abra o navegador e digite o endereço: </w:t>
       </w:r>
-      <w:hyperlink w:history="1" r:id="rIdgecufpqgcb9ccsf4iqlbk">
+      <w:hyperlink w:history="1" r:id="rId0fevvsb3ijapdkzasou_o">
         <w:r>
           <w:rPr>
             <w:rStyle w:val="Hyperlink"/>
@@ -3132,7 +3562,15 @@
         <w:pStyle w:val="Heading1"/>
       </w:pPr>
       <w:r>
-        <w:t xml:space="preserve">9. Sair da conta</w:t>
+        <w:t xml:space="preserve">9. Fazer check-in</w:t>
+      </w:r>
+    </w:p>
+    <w:p>
+      <w:pPr>
+        <w:spacing w:after="120" w:line="300"/>
+      </w:pPr>
+      <w:r>
+        <w:t xml:space="preserve">O check-in mantém o mapa confiável: você informa como o ponto está agora, e essa informação aparece para todos os motoristas por 2 horas. Depois desse prazo, o ponto volta a aparecer como "Não verificado".</w:t>
       </w:r>
     </w:p>
     <w:p>
@@ -3145,6 +3583,1082 @@
         <w:spacing w:after="80" w:line="290"/>
       </w:pPr>
       <w:r>
+        <w:t xml:space="preserve">Abra a página do ponto (seção 7) e role até </w:t>
+      </w:r>
+      <w:r>
+        <w:rPr>
+          <w:b/>
+          <w:bCs/>
+        </w:rPr>
+        <w:t xml:space="preserve">Fazer check-in</w:t>
+      </w:r>
+      <w:r>
+        <w:t xml:space="preserve">. É preciso estar logado.</w:t>
+      </w:r>
+    </w:p>
+    <w:p>
+      <w:pPr>
+        <w:pStyle w:val="ListParagraph"/>
+        <w:numPr>
+          <w:ilvl w:val="0"/>
+          <w:numId w:val="11"/>
+        </w:numPr>
+        <w:spacing w:after="80" w:line="290"/>
+      </w:pPr>
+      <w:r>
+        <w:t xml:space="preserve">Escolha o status: </w:t>
+      </w:r>
+      <w:r>
+        <w:rPr>
+          <w:b/>
+          <w:bCs/>
+        </w:rPr>
+        <w:t xml:space="preserve">Disponível</w:t>
+      </w:r>
+      <w:r>
+        <w:t xml:space="preserve">, </w:t>
+      </w:r>
+      <w:r>
+        <w:rPr>
+          <w:b/>
+          <w:bCs/>
+        </w:rPr>
+        <w:t xml:space="preserve">Ocupado</w:t>
+      </w:r>
+      <w:r>
+        <w:t xml:space="preserve"> ou </w:t>
+      </w:r>
+      <w:r>
+        <w:rPr>
+          <w:b/>
+          <w:bCs/>
+        </w:rPr>
+        <w:t xml:space="preserve">Fora de serviço</w:t>
+      </w:r>
+      <w:r>
+        <w:t xml:space="preserve">.</w:t>
+      </w:r>
+    </w:p>
+    <w:p>
+      <w:pPr>
+        <w:pStyle w:val="ListParagraph"/>
+        <w:numPr>
+          <w:ilvl w:val="0"/>
+          <w:numId w:val="11"/>
+        </w:numPr>
+        <w:spacing w:after="80" w:line="290"/>
+      </w:pPr>
+      <w:r>
+        <w:t xml:space="preserve">Se quiser, escreva um </w:t>
+      </w:r>
+      <w:r>
+        <w:rPr>
+          <w:b/>
+          <w:bCs/>
+        </w:rPr>
+        <w:t xml:space="preserve">comentário</w:t>
+      </w:r>
+      <w:r>
+        <w:t xml:space="preserve"> (por exemplo, "Dois carregadores livres agora").</w:t>
+      </w:r>
+    </w:p>
+    <w:p>
+      <w:pPr>
+        <w:pStyle w:val="ListParagraph"/>
+        <w:numPr>
+          <w:ilvl w:val="0"/>
+          <w:numId w:val="11"/>
+        </w:numPr>
+        <w:spacing w:after="80" w:line="290"/>
+      </w:pPr>
+      <w:r>
+        <w:t xml:space="preserve">Toque em </w:t>
+      </w:r>
+      <w:r>
+        <w:rPr>
+          <w:b/>
+          <w:bCs/>
+        </w:rPr>
+        <w:t xml:space="preserve">Confirmar Check-in</w:t>
+      </w:r>
+      <w:r>
+        <w:t xml:space="preserve">. O status do ponto é atualizado na hora, com a indicação "Status informado por check-in agora".</w:t>
+      </w:r>
+    </w:p>
+    <w:p>
+      <w:pPr>
+        <w:keepNext/>
+        <w:keepLines/>
+        <w:spacing w:after="60" w:before="160"/>
+        <w:jc w:val="center"/>
+      </w:pPr>
+      <w:r>
+        <w:drawing>
+          <wp:inline distT="0" distB="0" distL="0" distR="0">
+            <wp:extent cx="2857500" cy="2705100"/>
+            <wp:effectExtent t="0" r="0" b="0" l="0"/>
+            <wp:docPr id="1" name="g_checkin.jpg" descr="Check-in na página do ponto" title="Check-in na página do ponto"/>
+            <wp:cNvGraphicFramePr>
+              <a:graphicFrameLocks xmlns:a="http://schemas.openxmlformats.org/drawingml/2006/main" noChangeAspect="1"/>
+            </wp:cNvGraphicFramePr>
+            <a:graphic xmlns:a="http://schemas.openxmlformats.org/drawingml/2006/main">
+              <a:graphicData uri="http://schemas.openxmlformats.org/drawingml/2006/picture">
+                <pic:pic xmlns:pic="http://schemas.openxmlformats.org/drawingml/2006/picture">
+                  <pic:nvPicPr>
+                    <pic:cNvPr id="0" name="" descr=""/>
+                    <pic:cNvPicPr>
+                      <a:picLocks noChangeAspect="1" noChangeArrowheads="1"/>
+                    </pic:cNvPicPr>
+                  </pic:nvPicPr>
+                  <pic:blipFill>
+                    <a:blip r:embed="rId17" cstate="none"/>
+                    <a:srcRect/>
+                    <a:stretch>
+                      <a:fillRect/>
+                    </a:stretch>
+                  </pic:blipFill>
+                  <pic:spPr bwMode="auto">
+                    <a:xfrm>
+                      <a:off x="0" y="0"/>
+                      <a:ext cx="2857500" cy="2705100"/>
+                    </a:xfrm>
+                    <a:prstGeom prst="rect">
+                      <a:avLst/>
+                    </a:prstGeom>
+                  </pic:spPr>
+                </pic:pic>
+              </a:graphicData>
+            </a:graphic>
+          </wp:inline>
+        </w:drawing>
+      </w:r>
+    </w:p>
+    <w:p>
+      <w:pPr>
+        <w:spacing w:after="240"/>
+        <w:jc w:val="center"/>
+      </w:pPr>
+      <w:r>
+        <w:rPr>
+          <w:i/>
+          <w:iCs/>
+          <w:color w:val="6B7280"/>
+          <w:sz w:val="18"/>
+          <w:szCs w:val="18"/>
+        </w:rPr>
+        <w:t xml:space="preserve">Figura 10 – Check-in na página do ponto</w:t>
+      </w:r>
+    </w:p>
+    <w:p>
+      <w:pPr>
+        <w:spacing w:after="120" w:line="300"/>
+      </w:pPr>
+      <w:r>
+        <w:t xml:space="preserve">Os últimos check-ins aparecem em </w:t>
+      </w:r>
+      <w:r>
+        <w:rPr>
+          <w:b/>
+          <w:bCs/>
+        </w:rPr>
+        <w:t xml:space="preserve">Check-ins recentes</w:t>
+      </w:r>
+      <w:r>
+        <w:t xml:space="preserve">, com o nome do motorista, o horário e o comentário. Se você informar </w:t>
+      </w:r>
+      <w:r>
+        <w:rPr>
+          <w:b/>
+          <w:bCs/>
+        </w:rPr>
+        <w:t xml:space="preserve">Fora de serviço</w:t>
+      </w:r>
+      <w:r>
+        <w:t xml:space="preserve">, o ponto fica sinalizado para verificação.</w:t>
+      </w:r>
+    </w:p>
+    <w:p>
+      <w:pPr>
+        <w:keepNext/>
+        <w:keepLines/>
+        <w:spacing w:after="60" w:before="160"/>
+        <w:jc w:val="center"/>
+      </w:pPr>
+      <w:r>
+        <w:drawing>
+          <wp:inline distT="0" distB="0" distL="0" distR="0">
+            <wp:extent cx="2857500" cy="1038225"/>
+            <wp:effectExtent t="0" r="0" b="0" l="0"/>
+            <wp:docPr id="1" name="g_historico.jpg" descr="Lista de check-ins recentes" title="Lista de check-ins recentes"/>
+            <wp:cNvGraphicFramePr>
+              <a:graphicFrameLocks xmlns:a="http://schemas.openxmlformats.org/drawingml/2006/main" noChangeAspect="1"/>
+            </wp:cNvGraphicFramePr>
+            <a:graphic xmlns:a="http://schemas.openxmlformats.org/drawingml/2006/main">
+              <a:graphicData uri="http://schemas.openxmlformats.org/drawingml/2006/picture">
+                <pic:pic xmlns:pic="http://schemas.openxmlformats.org/drawingml/2006/picture">
+                  <pic:nvPicPr>
+                    <pic:cNvPr id="0" name="" descr=""/>
+                    <pic:cNvPicPr>
+                      <a:picLocks noChangeAspect="1" noChangeArrowheads="1"/>
+                    </pic:cNvPicPr>
+                  </pic:nvPicPr>
+                  <pic:blipFill>
+                    <a:blip r:embed="rId18" cstate="none"/>
+                    <a:srcRect/>
+                    <a:stretch>
+                      <a:fillRect/>
+                    </a:stretch>
+                  </pic:blipFill>
+                  <pic:spPr bwMode="auto">
+                    <a:xfrm>
+                      <a:off x="0" y="0"/>
+                      <a:ext cx="2857500" cy="1038225"/>
+                    </a:xfrm>
+                    <a:prstGeom prst="rect">
+                      <a:avLst/>
+                    </a:prstGeom>
+                  </pic:spPr>
+                </pic:pic>
+              </a:graphicData>
+            </a:graphic>
+          </wp:inline>
+        </w:drawing>
+      </w:r>
+    </w:p>
+    <w:p>
+      <w:pPr>
+        <w:spacing w:after="240"/>
+        <w:jc w:val="center"/>
+      </w:pPr>
+      <w:r>
+        <w:rPr>
+          <w:i/>
+          <w:iCs/>
+          <w:color w:val="6B7280"/>
+          <w:sz w:val="18"/>
+          <w:szCs w:val="18"/>
+        </w:rPr>
+        <w:t xml:space="preserve">Figura 11 – Lista de check-ins recentes</w:t>
+      </w:r>
+    </w:p>
+    <w:p>
+      <w:pPr>
+        <w:pStyle w:val="Heading1"/>
+      </w:pPr>
+      <w:r>
+        <w:t xml:space="preserve">10. Recarga ativa</w:t>
+      </w:r>
+    </w:p>
+    <w:p>
+      <w:pPr>
+        <w:spacing w:after="120" w:line="300"/>
+      </w:pPr>
+      <w:r>
+        <w:t xml:space="preserve">Ao chegar ao ponto e começar a carregar, avise os outros motoristas: o ponto passa a aparecer como ocupado enquanto você estiver carregando.</w:t>
+      </w:r>
+    </w:p>
+    <w:p>
+      <w:pPr>
+        <w:pStyle w:val="ListParagraph"/>
+        <w:numPr>
+          <w:ilvl w:val="0"/>
+          <w:numId w:val="12"/>
+        </w:numPr>
+        <w:spacing w:after="80" w:line="290"/>
+      </w:pPr>
+      <w:r>
+        <w:t xml:space="preserve">Na página do ponto, em </w:t>
+      </w:r>
+      <w:r>
+        <w:rPr>
+          <w:b/>
+          <w:bCs/>
+        </w:rPr>
+        <w:t xml:space="preserve">Recarga</w:t>
+      </w:r>
+      <w:r>
+        <w:t xml:space="preserve">, toque em </w:t>
+      </w:r>
+      <w:r>
+        <w:rPr>
+          <w:b/>
+          <w:bCs/>
+        </w:rPr>
+        <w:t xml:space="preserve">⚡ Iniciar recarga aqui</w:t>
+      </w:r>
+      <w:r>
+        <w:t xml:space="preserve">.</w:t>
+      </w:r>
+    </w:p>
+    <w:p>
+      <w:pPr>
+        <w:pStyle w:val="ListParagraph"/>
+        <w:numPr>
+          <w:ilvl w:val="0"/>
+          <w:numId w:val="12"/>
+        </w:numPr>
+        <w:spacing w:after="80" w:line="290"/>
+      </w:pPr>
+      <w:r>
+        <w:t xml:space="preserve">O ponto fica </w:t>
+      </w:r>
+      <w:r>
+        <w:rPr>
+          <w:b/>
+          <w:bCs/>
+        </w:rPr>
+        <w:t xml:space="preserve">Ocupado</w:t>
+      </w:r>
+      <w:r>
+        <w:t xml:space="preserve"> e aparece o aviso </w:t>
+      </w:r>
+      <w:r>
+        <w:rPr>
+          <w:b/>
+          <w:bCs/>
+        </w:rPr>
+        <w:t xml:space="preserve">"Você está carregando aqui"</w:t>
+      </w:r>
+      <w:r>
+        <w:t xml:space="preserve">, com o horário de início e a validade (2 horas).</w:t>
+      </w:r>
+    </w:p>
+    <w:p>
+      <w:pPr>
+        <w:pStyle w:val="ListParagraph"/>
+        <w:numPr>
+          <w:ilvl w:val="0"/>
+          <w:numId w:val="12"/>
+        </w:numPr>
+        <w:spacing w:after="80" w:line="290"/>
+      </w:pPr>
+      <w:r>
+        <w:t xml:space="preserve">Enquanto a recarga estiver ativa, uma faixa verde no topo do mapa mostra onde você está carregando. Toque nela para abrir o ponto.</w:t>
+      </w:r>
+    </w:p>
+    <w:p>
+      <w:pPr>
+        <w:pStyle w:val="ListParagraph"/>
+        <w:numPr>
+          <w:ilvl w:val="0"/>
+          <w:numId w:val="12"/>
+        </w:numPr>
+        <w:spacing w:after="80" w:line="290"/>
+      </w:pPr>
+      <w:r>
+        <w:t xml:space="preserve">Ao terminar, toque em </w:t>
+      </w:r>
+      <w:r>
+        <w:rPr>
+          <w:b/>
+          <w:bCs/>
+        </w:rPr>
+        <w:t xml:space="preserve">Encerrar recarga e liberar a vaga</w:t>
+      </w:r>
+      <w:r>
+        <w:t xml:space="preserve">. O ponto volta a ficar </w:t>
+      </w:r>
+      <w:r>
+        <w:rPr>
+          <w:b/>
+          <w:bCs/>
+        </w:rPr>
+        <w:t xml:space="preserve">Disponível</w:t>
+      </w:r>
+      <w:r>
+        <w:t xml:space="preserve"> e o VoltMap informa quanto tempo durou a recarga.</w:t>
+      </w:r>
+    </w:p>
+    <w:p>
+      <w:pPr>
+        <w:keepNext/>
+        <w:keepLines/>
+        <w:spacing w:after="60" w:before="160"/>
+        <w:jc w:val="center"/>
+      </w:pPr>
+      <w:r>
+        <w:drawing>
+          <wp:inline distT="0" distB="0" distL="0" distR="0">
+            <wp:extent cx="2857500" cy="1533525"/>
+            <wp:effectExtent t="0" r="0" b="0" l="0"/>
+            <wp:docPr id="1" name="g_recarga.jpg" descr="Recarga ativa na página do ponto" title="Recarga ativa na página do ponto"/>
+            <wp:cNvGraphicFramePr>
+              <a:graphicFrameLocks xmlns:a="http://schemas.openxmlformats.org/drawingml/2006/main" noChangeAspect="1"/>
+            </wp:cNvGraphicFramePr>
+            <a:graphic xmlns:a="http://schemas.openxmlformats.org/drawingml/2006/main">
+              <a:graphicData uri="http://schemas.openxmlformats.org/drawingml/2006/picture">
+                <pic:pic xmlns:pic="http://schemas.openxmlformats.org/drawingml/2006/picture">
+                  <pic:nvPicPr>
+                    <pic:cNvPr id="0" name="" descr=""/>
+                    <pic:cNvPicPr>
+                      <a:picLocks noChangeAspect="1" noChangeArrowheads="1"/>
+                    </pic:cNvPicPr>
+                  </pic:nvPicPr>
+                  <pic:blipFill>
+                    <a:blip r:embed="rId19" cstate="none"/>
+                    <a:srcRect/>
+                    <a:stretch>
+                      <a:fillRect/>
+                    </a:stretch>
+                  </pic:blipFill>
+                  <pic:spPr bwMode="auto">
+                    <a:xfrm>
+                      <a:off x="0" y="0"/>
+                      <a:ext cx="2857500" cy="1533525"/>
+                    </a:xfrm>
+                    <a:prstGeom prst="rect">
+                      <a:avLst/>
+                    </a:prstGeom>
+                  </pic:spPr>
+                </pic:pic>
+              </a:graphicData>
+            </a:graphic>
+          </wp:inline>
+        </w:drawing>
+      </w:r>
+    </w:p>
+    <w:p>
+      <w:pPr>
+        <w:spacing w:after="240"/>
+        <w:jc w:val="center"/>
+      </w:pPr>
+      <w:r>
+        <w:rPr>
+          <w:i/>
+          <w:iCs/>
+          <w:color w:val="6B7280"/>
+          <w:sz w:val="18"/>
+          <w:szCs w:val="18"/>
+        </w:rPr>
+        <w:t xml:space="preserve">Figura 12 – Recarga ativa na página do ponto</w:t>
+      </w:r>
+    </w:p>
+    <w:p>
+      <w:pPr>
+        <w:keepNext/>
+        <w:keepLines/>
+        <w:spacing w:after="60" w:before="160"/>
+        <w:jc w:val="center"/>
+      </w:pPr>
+      <w:r>
+        <w:drawing>
+          <wp:inline distT="0" distB="0" distL="0" distR="0">
+            <wp:extent cx="2857500" cy="1390650"/>
+            <wp:effectExtent t="0" r="0" b="0" l="0"/>
+            <wp:docPr id="1" name="g_faixa.jpg" descr="Aviso de recarga ativa no topo do mapa" title="Aviso de recarga ativa no topo do mapa"/>
+            <wp:cNvGraphicFramePr>
+              <a:graphicFrameLocks xmlns:a="http://schemas.openxmlformats.org/drawingml/2006/main" noChangeAspect="1"/>
+            </wp:cNvGraphicFramePr>
+            <a:graphic xmlns:a="http://schemas.openxmlformats.org/drawingml/2006/main">
+              <a:graphicData uri="http://schemas.openxmlformats.org/drawingml/2006/picture">
+                <pic:pic xmlns:pic="http://schemas.openxmlformats.org/drawingml/2006/picture">
+                  <pic:nvPicPr>
+                    <pic:cNvPr id="0" name="" descr=""/>
+                    <pic:cNvPicPr>
+                      <a:picLocks noChangeAspect="1" noChangeArrowheads="1"/>
+                    </pic:cNvPicPr>
+                  </pic:nvPicPr>
+                  <pic:blipFill>
+                    <a:blip r:embed="rId20" cstate="none"/>
+                    <a:srcRect/>
+                    <a:stretch>
+                      <a:fillRect/>
+                    </a:stretch>
+                  </pic:blipFill>
+                  <pic:spPr bwMode="auto">
+                    <a:xfrm>
+                      <a:off x="0" y="0"/>
+                      <a:ext cx="2857500" cy="1390650"/>
+                    </a:xfrm>
+                    <a:prstGeom prst="rect">
+                      <a:avLst/>
+                    </a:prstGeom>
+                  </pic:spPr>
+                </pic:pic>
+              </a:graphicData>
+            </a:graphic>
+          </wp:inline>
+        </w:drawing>
+      </w:r>
+    </w:p>
+    <w:p>
+      <w:pPr>
+        <w:spacing w:after="240"/>
+        <w:jc w:val="center"/>
+      </w:pPr>
+      <w:r>
+        <w:rPr>
+          <w:i/>
+          <w:iCs/>
+          <w:color w:val="6B7280"/>
+          <w:sz w:val="18"/>
+          <w:szCs w:val="18"/>
+        </w:rPr>
+        <w:t xml:space="preserve">Figura 13 – Aviso de recarga ativa no topo do mapa</w:t>
+      </w:r>
+    </w:p>
+    <w:p>
+      <w:pPr>
+        <w:spacing w:after="120" w:line="300"/>
+      </w:pPr>
+      <w:r>
+        <w:rPr>
+          <w:i/>
+          <w:iCs/>
+          <w:color w:val="6B7280"/>
+        </w:rPr>
+        <w:t xml:space="preserve">Só é possível ter uma recarga ativa por vez, e não é possível iniciar recarga em um ponto fora de serviço.</w:t>
+      </w:r>
+    </w:p>
+    <w:p>
+      <w:pPr>
+        <w:pStyle w:val="Heading1"/>
+      </w:pPr>
+      <w:r>
+        <w:t xml:space="preserve">11. Favoritar pontos de recarga</w:t>
+      </w:r>
+    </w:p>
+    <w:p>
+      <w:pPr>
+        <w:pStyle w:val="ListParagraph"/>
+        <w:numPr>
+          <w:ilvl w:val="0"/>
+          <w:numId w:val="13"/>
+        </w:numPr>
+        <w:spacing w:after="80" w:line="290"/>
+      </w:pPr>
+      <w:r>
+        <w:t xml:space="preserve">Na página do ponto, toque na estrela </w:t>
+      </w:r>
+      <w:r>
+        <w:rPr>
+          <w:b/>
+          <w:bCs/>
+        </w:rPr>
+        <w:t xml:space="preserve">☆</w:t>
+      </w:r>
+      <w:r>
+        <w:t xml:space="preserve"> ao lado do status. Ela fica amarela (</w:t>
+      </w:r>
+      <w:r>
+        <w:rPr>
+          <w:b/>
+          <w:bCs/>
+        </w:rPr>
+        <w:t xml:space="preserve">★</w:t>
+      </w:r>
+      <w:r>
+        <w:t xml:space="preserve">) e o ponto é salvo nos seus favoritos.</w:t>
+      </w:r>
+    </w:p>
+    <w:p>
+      <w:pPr>
+        <w:pStyle w:val="ListParagraph"/>
+        <w:numPr>
+          <w:ilvl w:val="0"/>
+          <w:numId w:val="13"/>
+        </w:numPr>
+        <w:spacing w:after="80" w:line="290"/>
+      </w:pPr>
+      <w:r>
+        <w:t xml:space="preserve">Para remover, toque na estrela de novo.</w:t>
+      </w:r>
+    </w:p>
+    <w:p>
+      <w:pPr>
+        <w:pStyle w:val="ListParagraph"/>
+        <w:numPr>
+          <w:ilvl w:val="0"/>
+          <w:numId w:val="13"/>
+        </w:numPr>
+        <w:spacing w:after="80" w:line="290"/>
+      </w:pPr>
+      <w:r>
+        <w:t xml:space="preserve">Seus favoritos ficam em </w:t>
+      </w:r>
+      <w:r>
+        <w:rPr>
+          <w:b/>
+          <w:bCs/>
+        </w:rPr>
+        <w:t xml:space="preserve">Meu perfil</w:t>
+      </w:r>
+      <w:r>
+        <w:t xml:space="preserve"> (seção 12), para acesso rápido.</w:t>
+      </w:r>
+    </w:p>
+    <w:p>
+      <w:pPr>
+        <w:keepNext/>
+        <w:keepLines/>
+        <w:spacing w:after="60" w:before="160"/>
+        <w:jc w:val="center"/>
+      </w:pPr>
+      <w:r>
+        <w:drawing>
+          <wp:inline distT="0" distB="0" distL="0" distR="0">
+            <wp:extent cx="2857500" cy="876300"/>
+            <wp:effectExtent t="0" r="0" b="0" l="0"/>
+            <wp:docPr id="1" name="g_favorito.jpg" descr="Estrela de favorito na página do ponto" title="Estrela de favorito na página do ponto"/>
+            <wp:cNvGraphicFramePr>
+              <a:graphicFrameLocks xmlns:a="http://schemas.openxmlformats.org/drawingml/2006/main" noChangeAspect="1"/>
+            </wp:cNvGraphicFramePr>
+            <a:graphic xmlns:a="http://schemas.openxmlformats.org/drawingml/2006/main">
+              <a:graphicData uri="http://schemas.openxmlformats.org/drawingml/2006/picture">
+                <pic:pic xmlns:pic="http://schemas.openxmlformats.org/drawingml/2006/picture">
+                  <pic:nvPicPr>
+                    <pic:cNvPr id="0" name="" descr=""/>
+                    <pic:cNvPicPr>
+                      <a:picLocks noChangeAspect="1" noChangeArrowheads="1"/>
+                    </pic:cNvPicPr>
+                  </pic:nvPicPr>
+                  <pic:blipFill>
+                    <a:blip r:embed="rId21" cstate="none"/>
+                    <a:srcRect/>
+                    <a:stretch>
+                      <a:fillRect/>
+                    </a:stretch>
+                  </pic:blipFill>
+                  <pic:spPr bwMode="auto">
+                    <a:xfrm>
+                      <a:off x="0" y="0"/>
+                      <a:ext cx="2857500" cy="876300"/>
+                    </a:xfrm>
+                    <a:prstGeom prst="rect">
+                      <a:avLst/>
+                    </a:prstGeom>
+                  </pic:spPr>
+                </pic:pic>
+              </a:graphicData>
+            </a:graphic>
+          </wp:inline>
+        </w:drawing>
+      </w:r>
+    </w:p>
+    <w:p>
+      <w:pPr>
+        <w:spacing w:after="240"/>
+        <w:jc w:val="center"/>
+      </w:pPr>
+      <w:r>
+        <w:rPr>
+          <w:i/>
+          <w:iCs/>
+          <w:color w:val="6B7280"/>
+          <w:sz w:val="18"/>
+          <w:szCs w:val="18"/>
+        </w:rPr>
+        <w:t xml:space="preserve">Figura 14 – Estrela de favorito na página do ponto</w:t>
+      </w:r>
+    </w:p>
+    <w:p>
+      <w:pPr>
+        <w:pStyle w:val="Heading1"/>
+      </w:pPr>
+      <w:r>
+        <w:t xml:space="preserve">12. Meu perfil</w:t>
+      </w:r>
+    </w:p>
+    <w:p>
+      <w:pPr>
+        <w:spacing w:after="120" w:line="300"/>
+      </w:pPr>
+      <w:r>
+        <w:t xml:space="preserve">Toque no seu </w:t>
+      </w:r>
+      <w:r>
+        <w:rPr>
+          <w:b/>
+          <w:bCs/>
+        </w:rPr>
+        <w:t xml:space="preserve">nome</w:t>
+      </w:r>
+      <w:r>
+        <w:t xml:space="preserve"> (ou na inicial em verde), no canto superior direito, para abrir o seu perfil. Nele você encontra:</w:t>
+      </w:r>
+    </w:p>
+    <w:p>
+      <w:pPr>
+        <w:pStyle w:val="ListParagraph"/>
+        <w:numPr>
+          <w:ilvl w:val="0"/>
+          <w:numId w:val="14"/>
+        </w:numPr>
+        <w:spacing w:after="80" w:line="290"/>
+      </w:pPr>
+      <w:r>
+        <w:rPr>
+          <w:b/>
+          <w:bCs/>
+        </w:rPr>
+        <w:t xml:space="preserve">Recarga ativa</w:t>
+      </w:r>
+      <w:r>
+        <w:t xml:space="preserve">, com os botões para ver o ponto ou encerrar a recarga.</w:t>
+      </w:r>
+    </w:p>
+    <w:p>
+      <w:pPr>
+        <w:pStyle w:val="ListParagraph"/>
+        <w:numPr>
+          <w:ilvl w:val="0"/>
+          <w:numId w:val="14"/>
+        </w:numPr>
+        <w:spacing w:after="80" w:line="290"/>
+      </w:pPr>
+      <w:r>
+        <w:rPr>
+          <w:b/>
+          <w:bCs/>
+        </w:rPr>
+        <w:t xml:space="preserve">Resumo</w:t>
+      </w:r>
+      <w:r>
+        <w:t xml:space="preserve">: quantos pontos você cadastrou, quantos favoritos tem e seus check-ins recentes.</w:t>
+      </w:r>
+    </w:p>
+    <w:p>
+      <w:pPr>
+        <w:pStyle w:val="ListParagraph"/>
+        <w:numPr>
+          <w:ilvl w:val="0"/>
+          <w:numId w:val="14"/>
+        </w:numPr>
+        <w:spacing w:after="80" w:line="290"/>
+      </w:pPr>
+      <w:r>
+        <w:rPr>
+          <w:b/>
+          <w:bCs/>
+        </w:rPr>
+        <w:t xml:space="preserve">Meus favoritos</w:t>
+      </w:r>
+      <w:r>
+        <w:t xml:space="preserve">, </w:t>
+      </w:r>
+      <w:r>
+        <w:rPr>
+          <w:b/>
+          <w:bCs/>
+        </w:rPr>
+        <w:t xml:space="preserve">Pontos que cadastrei</w:t>
+      </w:r>
+      <w:r>
+        <w:t xml:space="preserve"> e </w:t>
+      </w:r>
+      <w:r>
+        <w:rPr>
+          <w:b/>
+          <w:bCs/>
+        </w:rPr>
+        <w:t xml:space="preserve">Meus check-ins recentes</w:t>
+      </w:r>
+      <w:r>
+        <w:t xml:space="preserve">. Toque em qualquer item para abrir o ponto.</w:t>
+      </w:r>
+    </w:p>
+    <w:p>
+      <w:pPr>
+        <w:pStyle w:val="ListParagraph"/>
+        <w:numPr>
+          <w:ilvl w:val="0"/>
+          <w:numId w:val="14"/>
+        </w:numPr>
+        <w:spacing w:after="80" w:line="290"/>
+      </w:pPr>
+      <w:r>
+        <w:rPr>
+          <w:b/>
+          <w:bCs/>
+        </w:rPr>
+        <w:t xml:space="preserve">Meus dados</w:t>
+      </w:r>
+      <w:r>
+        <w:t xml:space="preserve">: altere o seu nome e toque em </w:t>
+      </w:r>
+      <w:r>
+        <w:rPr>
+          <w:b/>
+          <w:bCs/>
+        </w:rPr>
+        <w:t xml:space="preserve">Salvar dados</w:t>
+      </w:r>
+      <w:r>
+        <w:t xml:space="preserve">.</w:t>
+      </w:r>
+    </w:p>
+    <w:p>
+      <w:pPr>
+        <w:pStyle w:val="ListParagraph"/>
+        <w:numPr>
+          <w:ilvl w:val="0"/>
+          <w:numId w:val="14"/>
+        </w:numPr>
+        <w:spacing w:after="80" w:line="290"/>
+      </w:pPr>
+      <w:r>
+        <w:rPr>
+          <w:b/>
+          <w:bCs/>
+        </w:rPr>
+        <w:t xml:space="preserve">Alterar senha</w:t>
+      </w:r>
+      <w:r>
+        <w:t xml:space="preserve">: informe a senha atual e a nova senha duas vezes.</w:t>
+      </w:r>
+    </w:p>
+    <w:p>
+      <w:pPr>
+        <w:keepNext/>
+        <w:keepLines/>
+        <w:spacing w:after="60" w:before="160"/>
+        <w:jc w:val="center"/>
+      </w:pPr>
+      <w:r>
+        <w:drawing>
+          <wp:inline distT="0" distB="0" distL="0" distR="0">
+            <wp:extent cx="2667000" cy="4543425"/>
+            <wp:effectExtent t="0" r="0" b="0" l="0"/>
+            <wp:docPr id="1" name="g_perfil.jpg" descr="Tela Meu perfil" title="Tela Meu perfil"/>
+            <wp:cNvGraphicFramePr>
+              <a:graphicFrameLocks xmlns:a="http://schemas.openxmlformats.org/drawingml/2006/main" noChangeAspect="1"/>
+            </wp:cNvGraphicFramePr>
+            <a:graphic xmlns:a="http://schemas.openxmlformats.org/drawingml/2006/main">
+              <a:graphicData uri="http://schemas.openxmlformats.org/drawingml/2006/picture">
+                <pic:pic xmlns:pic="http://schemas.openxmlformats.org/drawingml/2006/picture">
+                  <pic:nvPicPr>
+                    <pic:cNvPr id="0" name="" descr=""/>
+                    <pic:cNvPicPr>
+                      <a:picLocks noChangeAspect="1" noChangeArrowheads="1"/>
+                    </pic:cNvPicPr>
+                  </pic:nvPicPr>
+                  <pic:blipFill>
+                    <a:blip r:embed="rId22" cstate="none"/>
+                    <a:srcRect/>
+                    <a:stretch>
+                      <a:fillRect/>
+                    </a:stretch>
+                  </pic:blipFill>
+                  <pic:spPr bwMode="auto">
+                    <a:xfrm>
+                      <a:off x="0" y="0"/>
+                      <a:ext cx="2667000" cy="4543425"/>
+                    </a:xfrm>
+                    <a:prstGeom prst="rect">
+                      <a:avLst/>
+                    </a:prstGeom>
+                  </pic:spPr>
+                </pic:pic>
+              </a:graphicData>
+            </a:graphic>
+          </wp:inline>
+        </w:drawing>
+      </w:r>
+    </w:p>
+    <w:p>
+      <w:pPr>
+        <w:spacing w:after="240"/>
+        <w:jc w:val="center"/>
+      </w:pPr>
+      <w:r>
+        <w:rPr>
+          <w:i/>
+          <w:iCs/>
+          <w:color w:val="6B7280"/>
+          <w:sz w:val="18"/>
+          <w:szCs w:val="18"/>
+        </w:rPr>
+        <w:t xml:space="preserve">Figura 15 – Tela Meu perfil</w:t>
+      </w:r>
+    </w:p>
+    <w:p>
+      <w:pPr>
+        <w:pStyle w:val="Heading1"/>
+      </w:pPr>
+      <w:r>
+        <w:t xml:space="preserve">13. Sobre o VoltMap (versão)</w:t>
+      </w:r>
+    </w:p>
+    <w:p>
+      <w:pPr>
+        <w:spacing w:after="120" w:line="300"/>
+      </w:pPr>
+      <w:r>
+        <w:t xml:space="preserve">Toque no ícone </w:t>
+      </w:r>
+      <w:r>
+        <w:rPr>
+          <w:b/>
+          <w:bCs/>
+        </w:rPr>
+        <w:t xml:space="preserve">ⓘ</w:t>
+      </w:r>
+      <w:r>
+        <w:t xml:space="preserve">, no topo de qualquer tela, ou em </w:t>
+      </w:r>
+      <w:r>
+        <w:rPr>
+          <w:b/>
+          <w:bCs/>
+        </w:rPr>
+        <w:t xml:space="preserve">Sobre o VoltMap</w:t>
+      </w:r>
+      <w:r>
+        <w:t xml:space="preserve"> no perfil. A tela mostra:</w:t>
+      </w:r>
+    </w:p>
+    <w:p>
+      <w:pPr>
+        <w:pStyle w:val="ListParagraph"/>
+        <w:numPr>
+          <w:ilvl w:val="0"/>
+          <w:numId w:val="15"/>
+        </w:numPr>
+        <w:spacing w:after="80" w:line="290"/>
+      </w:pPr>
+      <w:r>
+        <w:rPr>
+          <w:b/>
+          <w:bCs/>
+        </w:rPr>
+        <w:t xml:space="preserve">Versão publicada</w:t>
+      </w:r>
+      <w:r>
+        <w:t xml:space="preserve">: número da versão, tag no GitHub, commit publicado, data em que a versão entrou no ar e ambiente.</w:t>
+      </w:r>
+    </w:p>
+    <w:p>
+      <w:pPr>
+        <w:pStyle w:val="ListParagraph"/>
+        <w:numPr>
+          <w:ilvl w:val="0"/>
+          <w:numId w:val="15"/>
+        </w:numPr>
+        <w:spacing w:after="80" w:line="290"/>
+      </w:pPr>
+      <w:r>
+        <w:rPr>
+          <w:b/>
+          <w:bCs/>
+        </w:rPr>
+        <w:t xml:space="preserve">Novidades da versão</w:t>
+      </w:r>
+      <w:r>
+        <w:t xml:space="preserve"> e </w:t>
+      </w:r>
+      <w:r>
+        <w:rPr>
+          <w:b/>
+          <w:bCs/>
+        </w:rPr>
+        <w:t xml:space="preserve">Próximas versões</w:t>
+      </w:r>
+      <w:r>
+        <w:t xml:space="preserve">.</w:t>
+      </w:r>
+    </w:p>
+    <w:p>
+      <w:pPr>
+        <w:pStyle w:val="ListParagraph"/>
+        <w:numPr>
+          <w:ilvl w:val="0"/>
+          <w:numId w:val="15"/>
+        </w:numPr>
+        <w:spacing w:after="80" w:line="290"/>
+      </w:pPr>
+      <w:r>
+        <w:rPr>
+          <w:b/>
+          <w:bCs/>
+        </w:rPr>
+        <w:t xml:space="preserve">Histórico de versões</w:t>
+      </w:r>
+      <w:r>
+        <w:t xml:space="preserve">: as últimas alterações do código, lidas diretamente do repositório no GitHub.</w:t>
+      </w:r>
+    </w:p>
+    <w:p>
+      <w:pPr>
+        <w:keepNext/>
+        <w:keepLines/>
+        <w:spacing w:after="60" w:before="160"/>
+        <w:jc w:val="center"/>
+      </w:pPr>
+      <w:r>
+        <w:drawing>
+          <wp:inline distT="0" distB="0" distL="0" distR="0">
+            <wp:extent cx="2667000" cy="1600200"/>
+            <wp:effectExtent t="0" r="0" b="0" l="0"/>
+            <wp:docPr id="1" name="g_sobre.jpg" descr="Topo da tela Sobre o VoltMap" title="Topo da tela Sobre o VoltMap"/>
+            <wp:cNvGraphicFramePr>
+              <a:graphicFrameLocks xmlns:a="http://schemas.openxmlformats.org/drawingml/2006/main" noChangeAspect="1"/>
+            </wp:cNvGraphicFramePr>
+            <a:graphic xmlns:a="http://schemas.openxmlformats.org/drawingml/2006/main">
+              <a:graphicData uri="http://schemas.openxmlformats.org/drawingml/2006/picture">
+                <pic:pic xmlns:pic="http://schemas.openxmlformats.org/drawingml/2006/picture">
+                  <pic:nvPicPr>
+                    <pic:cNvPr id="0" name="" descr=""/>
+                    <pic:cNvPicPr>
+                      <a:picLocks noChangeAspect="1" noChangeArrowheads="1"/>
+                    </pic:cNvPicPr>
+                  </pic:nvPicPr>
+                  <pic:blipFill>
+                    <a:blip r:embed="rId23" cstate="none"/>
+                    <a:srcRect/>
+                    <a:stretch>
+                      <a:fillRect/>
+                    </a:stretch>
+                  </pic:blipFill>
+                  <pic:spPr bwMode="auto">
+                    <a:xfrm>
+                      <a:off x="0" y="0"/>
+                      <a:ext cx="2667000" cy="1600200"/>
+                    </a:xfrm>
+                    <a:prstGeom prst="rect">
+                      <a:avLst/>
+                    </a:prstGeom>
+                  </pic:spPr>
+                </pic:pic>
+              </a:graphicData>
+            </a:graphic>
+          </wp:inline>
+        </w:drawing>
+      </w:r>
+    </w:p>
+    <w:p>
+      <w:pPr>
+        <w:spacing w:after="240"/>
+        <w:jc w:val="center"/>
+      </w:pPr>
+      <w:r>
+        <w:rPr>
+          <w:i/>
+          <w:iCs/>
+          <w:color w:val="6B7280"/>
+          <w:sz w:val="18"/>
+          <w:szCs w:val="18"/>
+        </w:rPr>
+        <w:t xml:space="preserve">Figura 16 – Topo da tela Sobre o VoltMap</w:t>
+      </w:r>
+    </w:p>
+    <w:p>
+      <w:pPr>
+        <w:pStyle w:val="Heading1"/>
+      </w:pPr>
+      <w:r>
+        <w:t xml:space="preserve">14. Sair da conta</w:t>
+      </w:r>
+    </w:p>
+    <w:p>
+      <w:pPr>
+        <w:pStyle w:val="ListParagraph"/>
+        <w:numPr>
+          <w:ilvl w:val="0"/>
+          <w:numId w:val="16"/>
+        </w:numPr>
+        <w:spacing w:after="80" w:line="290"/>
+      </w:pPr>
+      <w:r>
         <w:t xml:space="preserve">Clique em </w:t>
       </w:r>
       <w:r>
@@ -3155,7 +4669,17 @@
         <w:t xml:space="preserve">Sair</w:t>
       </w:r>
       <w:r>
-        <w:t xml:space="preserve">, no canto superior direito de qualquer tela.</w:t>
+        <w:t xml:space="preserve">, no canto superior direito de qualquer tela, ou em </w:t>
+      </w:r>
+      <w:r>
+        <w:rPr>
+          <w:b/>
+          <w:bCs/>
+        </w:rPr>
+        <w:t xml:space="preserve">Sair da conta</w:t>
+      </w:r>
+      <w:r>
+        <w:t xml:space="preserve">, no final da tela Meu perfil.</w:t>
       </w:r>
     </w:p>
     <w:p>
@@ -3171,7 +4695,7 @@
         <w:pStyle w:val="Heading1"/>
       </w:pPr>
       <w:r>
-        <w:t xml:space="preserve">10. Problemas comuns</w:t>
+        <w:t xml:space="preserve">15. Problemas comuns</w:t>
       </w:r>
     </w:p>
     <w:tbl>
@@ -3559,7 +5083,7 @@
           <w:iCs/>
           <w:color w:val="6B7280"/>
         </w:rPr>
-        <w:t xml:space="preserve">As próximas versões trarão check-in de status, avaliações, favoritos, denúncias e fotos dos pontos.</w:t>
+        <w:t xml:space="preserve">As próximas versões trarão avaliações, denúncias, moderação pelo administrador e fotos dos pontos.</w:t>
       </w:r>
     </w:p>
     <w:sectPr>
@@ -3856,6 +5380,36 @@
     </w:lvlOverride>
   </w:num>
   <w:num w:numId="11">
+    <w:abstractNumId w:val="2"/>
+    <w:lvlOverride w:ilvl="0">
+      <w:startOverride w:val="1"/>
+    </w:lvlOverride>
+  </w:num>
+  <w:num w:numId="12">
+    <w:abstractNumId w:val="2"/>
+    <w:lvlOverride w:ilvl="0">
+      <w:startOverride w:val="1"/>
+    </w:lvlOverride>
+  </w:num>
+  <w:num w:numId="13">
+    <w:abstractNumId w:val="2"/>
+    <w:lvlOverride w:ilvl="0">
+      <w:startOverride w:val="1"/>
+    </w:lvlOverride>
+  </w:num>
+  <w:num w:numId="14">
+    <w:abstractNumId w:val="2"/>
+    <w:lvlOverride w:ilvl="0">
+      <w:startOverride w:val="1"/>
+    </w:lvlOverride>
+  </w:num>
+  <w:num w:numId="15">
+    <w:abstractNumId w:val="2"/>
+    <w:lvlOverride w:ilvl="0">
+      <w:startOverride w:val="1"/>
+    </w:lvlOverride>
+  </w:num>
+  <w:num w:numId="16">
     <w:abstractNumId w:val="2"/>
     <w:lvlOverride w:ilvl="0">
       <w:startOverride w:val="1"/>

</xml_diff>

<commit_message>
Docs: Guia do Usuário e diagrama com o pagamento da recarga (cartão e Pix)
Co-Authored-By: Claude Opus 5.5 <noreply@anthropic.com>
Claude-Session: https://claude.ai/code/session_01TW1SifSUPb9kTwyp6u2Fvv
</commit_message>
<xml_diff>
--- a/docs/Guia_do_Usuario_VoltMap_v0.1.docx
+++ b/docs/Guia_do_Usuario_VoltMap_v0.1.docx
@@ -64,7 +64,7 @@
         <w:spacing w:after="1200"/>
         <w:jc w:val="center"/>
       </w:pPr>
-      <w:hyperlink w:history="1" r:id="rIdyevmpyavkjpwtz1jwywtw">
+      <w:hyperlink w:history="1" r:id="rIdkzyaljtvak_nokpjpqap6">
         <w:r>
           <w:rPr>
             <w:rStyle w:val="Hyperlink"/>
@@ -1063,7 +1063,7 @@
                 <w:sz w:val="20"/>
                 <w:szCs w:val="20"/>
               </w:rPr>
-              <w:t xml:space="preserve">Favoritar pontos de recarga</w:t>
+              <w:t xml:space="preserve">Pagar a recarga com cartão de crédito ou Pix (demonstração)</w:t>
             </w:r>
           </w:p>
         </w:tc>
@@ -1119,7 +1119,7 @@
                 <w:sz w:val="20"/>
                 <w:szCs w:val="20"/>
               </w:rPr>
-              <w:t xml:space="preserve">11</w:t>
+              <w:t xml:space="preserve">10.1</w:t>
             </w:r>
           </w:p>
         </w:tc>
@@ -1149,7 +1149,7 @@
                 <w:sz w:val="20"/>
                 <w:szCs w:val="20"/>
               </w:rPr>
-              <w:t xml:space="preserve">Meu perfil: dados, senha, favoritos, pontos cadastrados e check-ins</w:t>
+              <w:t xml:space="preserve">Favoritar pontos de recarga</w:t>
             </w:r>
           </w:p>
         </w:tc>
@@ -1205,7 +1205,7 @@
                 <w:sz w:val="20"/>
                 <w:szCs w:val="20"/>
               </w:rPr>
-              <w:t xml:space="preserve">12</w:t>
+              <w:t xml:space="preserve">11</w:t>
             </w:r>
           </w:p>
         </w:tc>
@@ -1235,7 +1235,7 @@
                 <w:sz w:val="20"/>
                 <w:szCs w:val="20"/>
               </w:rPr>
-              <w:t xml:space="preserve">Sobre o VoltMap: versão publicada e histórico de versões</w:t>
+              <w:t xml:space="preserve">Meu perfil: dados, senha, favoritos, pontos cadastrados e check-ins</w:t>
             </w:r>
           </w:p>
         </w:tc>
@@ -1263,7 +1263,7 @@
                 <w:sz w:val="20"/>
                 <w:szCs w:val="20"/>
               </w:rPr>
-              <w:t xml:space="preserve">Não</w:t>
+              <w:t xml:space="preserve">Sim</w:t>
             </w:r>
           </w:p>
         </w:tc>
@@ -1291,6 +1291,92 @@
                 <w:sz w:val="20"/>
                 <w:szCs w:val="20"/>
               </w:rPr>
+              <w:t xml:space="preserve">12</w:t>
+            </w:r>
+          </w:p>
+        </w:tc>
+      </w:tr>
+      <w:tr>
+        <w:tc>
+          <w:tcPr>
+            <w:tcW w:type="dxa" w:w="5638"/>
+            <w:tcBorders>
+              <w:top w:val="single" w:color="D1D5DB" w:sz="4"/>
+              <w:left w:val="single" w:color="D1D5DB" w:sz="4"/>
+              <w:bottom w:val="single" w:color="D1D5DB" w:sz="4"/>
+              <w:right w:val="single" w:color="D1D5DB" w:sz="4"/>
+            </w:tcBorders>
+            <w:tcMar>
+              <w:top w:type="dxa" w:w="80"/>
+              <w:left w:type="dxa" w:w="120"/>
+              <w:bottom w:type="dxa" w:w="80"/>
+              <w:right w:type="dxa" w:w="120"/>
+            </w:tcMar>
+          </w:tcPr>
+          <w:p>
+            <w:r>
+              <w:rPr>
+                <w:b w:val="false"/>
+                <w:bCs w:val="false"/>
+                <w:sz w:val="20"/>
+                <w:szCs w:val="20"/>
+              </w:rPr>
+              <w:t xml:space="preserve">Sobre o VoltMap: versão publicada e histórico de versões</w:t>
+            </w:r>
+          </w:p>
+        </w:tc>
+        <w:tc>
+          <w:tcPr>
+            <w:tcW w:type="dxa" w:w="2000"/>
+            <w:tcBorders>
+              <w:top w:val="single" w:color="D1D5DB" w:sz="4"/>
+              <w:left w:val="single" w:color="D1D5DB" w:sz="4"/>
+              <w:bottom w:val="single" w:color="D1D5DB" w:sz="4"/>
+              <w:right w:val="single" w:color="D1D5DB" w:sz="4"/>
+            </w:tcBorders>
+            <w:tcMar>
+              <w:top w:type="dxa" w:w="80"/>
+              <w:left w:type="dxa" w:w="120"/>
+              <w:bottom w:type="dxa" w:w="80"/>
+              <w:right w:type="dxa" w:w="120"/>
+            </w:tcMar>
+          </w:tcPr>
+          <w:p>
+            <w:r>
+              <w:rPr>
+                <w:b w:val="false"/>
+                <w:bCs w:val="false"/>
+                <w:sz w:val="20"/>
+                <w:szCs w:val="20"/>
+              </w:rPr>
+              <w:t xml:space="preserve">Não</w:t>
+            </w:r>
+          </w:p>
+        </w:tc>
+        <w:tc>
+          <w:tcPr>
+            <w:tcW w:type="dxa" w:w="2000"/>
+            <w:tcBorders>
+              <w:top w:val="single" w:color="D1D5DB" w:sz="4"/>
+              <w:left w:val="single" w:color="D1D5DB" w:sz="4"/>
+              <w:bottom w:val="single" w:color="D1D5DB" w:sz="4"/>
+              <w:right w:val="single" w:color="D1D5DB" w:sz="4"/>
+            </w:tcBorders>
+            <w:tcMar>
+              <w:top w:type="dxa" w:w="80"/>
+              <w:left w:type="dxa" w:w="120"/>
+              <w:bottom w:type="dxa" w:w="80"/>
+              <w:right w:type="dxa" w:w="120"/>
+            </w:tcMar>
+          </w:tcPr>
+          <w:p>
+            <w:r>
+              <w:rPr>
+                <w:b w:val="false"/>
+                <w:bCs w:val="false"/>
+                <w:sz w:val="20"/>
+                <w:szCs w:val="20"/>
+              </w:rPr>
               <w:t xml:space="preserve">13</w:t>
             </w:r>
           </w:p>
@@ -1330,7 +1416,7 @@
       <w:r>
         <w:t xml:space="preserve">Abra o navegador e digite o endereço: </w:t>
       </w:r>
-      <w:hyperlink w:history="1" r:id="rId0fevvsb3ijapdkzasou_o">
+      <w:hyperlink w:history="1" r:id="rIdab-raajvio-kdfqhqu6sa">
         <w:r>
           <w:rPr>
             <w:rStyle w:val="Hyperlink"/>
@@ -4112,10 +4198,37 @@
     </w:p>
     <w:p>
       <w:pPr>
-        <w:pStyle w:val="Heading1"/>
-      </w:pPr>
-      <w:r>
-        <w:t xml:space="preserve">11. Favoritar pontos de recarga</w:t>
+        <w:pStyle w:val="Heading2"/>
+      </w:pPr>
+      <w:r>
+        <w:t xml:space="preserve">10.1 Pagamento da recarga (cartão ou Pix)</w:t>
+      </w:r>
+    </w:p>
+    <w:p>
+      <w:pPr>
+        <w:spacing w:after="120" w:line="300"/>
+      </w:pPr>
+      <w:r>
+        <w:rPr>
+          <w:b/>
+          <w:bCs/>
+        </w:rPr>
+        <w:t xml:space="preserve">Modo demonstração: </w:t>
+      </w:r>
+      <w:r>
+        <w:t xml:space="preserve">nesta versão nenhuma cobrança é realizada. O VoltMap mostra como o pagamento funcionaria, com o valor estimado da recarga.</w:t>
+      </w:r>
+    </w:p>
+    <w:p>
+      <w:pPr>
+        <w:spacing w:after="60"/>
+      </w:pPr>
+      <w:r>
+        <w:rPr>
+          <w:b/>
+          <w:bCs/>
+        </w:rPr>
+        <w:t xml:space="preserve">Cadastrar um cartão de crédito (opcional):</w:t>
       </w:r>
     </w:p>
     <w:p>
@@ -4128,27 +4241,27 @@
         <w:spacing w:after="80" w:line="290"/>
       </w:pPr>
       <w:r>
-        <w:t xml:space="preserve">Na página do ponto, toque na estrela </w:t>
-      </w:r>
-      <w:r>
-        <w:rPr>
-          <w:b/>
-          <w:bCs/>
-        </w:rPr>
-        <w:t xml:space="preserve">☆</w:t>
-      </w:r>
-      <w:r>
-        <w:t xml:space="preserve"> ao lado do status. Ela fica amarela (</w:t>
-      </w:r>
-      <w:r>
-        <w:rPr>
-          <w:b/>
-          <w:bCs/>
-        </w:rPr>
-        <w:t xml:space="preserve">★</w:t>
-      </w:r>
-      <w:r>
-        <w:t xml:space="preserve">) e o ponto é salvo nos seus favoritos.</w:t>
+        <w:t xml:space="preserve">Abra </w:t>
+      </w:r>
+      <w:r>
+        <w:rPr>
+          <w:b/>
+          <w:bCs/>
+        </w:rPr>
+        <w:t xml:space="preserve">Meu perfil</w:t>
+      </w:r>
+      <w:r>
+        <w:t xml:space="preserve"> e vá até </w:t>
+      </w:r>
+      <w:r>
+        <w:rPr>
+          <w:b/>
+          <w:bCs/>
+        </w:rPr>
+        <w:t xml:space="preserve">Formas de pagamento</w:t>
+      </w:r>
+      <w:r>
+        <w:t xml:space="preserve">.</w:t>
       </w:r>
     </w:p>
     <w:p>
@@ -4161,7 +4274,17 @@
         <w:spacing w:after="80" w:line="290"/>
       </w:pPr>
       <w:r>
-        <w:t xml:space="preserve">Para remover, toque na estrela de novo.</w:t>
+        <w:t xml:space="preserve">Toque em </w:t>
+      </w:r>
+      <w:r>
+        <w:rPr>
+          <w:b/>
+          <w:bCs/>
+        </w:rPr>
+        <w:t xml:space="preserve">＋ Cadastrar cartão de crédito</w:t>
+      </w:r>
+      <w:r>
+        <w:t xml:space="preserve"> e informe o número, o nome impresso e a validade (MM/AA). A bandeira é reconhecida automaticamente.</w:t>
       </w:r>
     </w:p>
     <w:p>
@@ -4174,17 +4297,55 @@
         <w:spacing w:after="80" w:line="290"/>
       </w:pPr>
       <w:r>
-        <w:t xml:space="preserve">Seus favoritos ficam em </w:t>
-      </w:r>
-      <w:r>
-        <w:rPr>
-          <w:b/>
-          <w:bCs/>
-        </w:rPr>
-        <w:t xml:space="preserve">Meu perfil</w:t>
-      </w:r>
-      <w:r>
-        <w:t xml:space="preserve"> (seção 12), para acesso rápido.</w:t>
+        <w:t xml:space="preserve">Toque em </w:t>
+      </w:r>
+      <w:r>
+        <w:rPr>
+          <w:b/>
+          <w:bCs/>
+        </w:rPr>
+        <w:t xml:space="preserve">Salvar cartão</w:t>
+      </w:r>
+      <w:r>
+        <w:t xml:space="preserve">. O primeiro cartão vira o </w:t>
+      </w:r>
+      <w:r>
+        <w:rPr>
+          <w:b/>
+          <w:bCs/>
+        </w:rPr>
+        <w:t xml:space="preserve">Padrão</w:t>
+      </w:r>
+      <w:r>
+        <w:t xml:space="preserve">. Você pode tornar outro cartão padrão ou remover um cartão.</w:t>
+      </w:r>
+    </w:p>
+    <w:p>
+      <w:pPr>
+        <w:spacing w:after="120" w:line="300"/>
+      </w:pPr>
+      <w:r>
+        <w:t xml:space="preserve">🔒 Por segurança, o VoltMap guarda apenas a </w:t>
+      </w:r>
+      <w:r>
+        <w:rPr>
+          <w:b/>
+          <w:bCs/>
+        </w:rPr>
+        <w:t xml:space="preserve">bandeira</w:t>
+      </w:r>
+      <w:r>
+        <w:t xml:space="preserve"> e os </w:t>
+      </w:r>
+      <w:r>
+        <w:rPr>
+          <w:b/>
+          <w:bCs/>
+        </w:rPr>
+        <w:t xml:space="preserve">4 últimos dígitos</w:t>
+      </w:r>
+      <w:r>
+        <w:t xml:space="preserve"> do cartão; o número completo não sai do seu aparelho. Para testar, use o número 4242 4242 4242 4242.</w:t>
       </w:r>
     </w:p>
     <w:p>
@@ -4197,9 +4358,9 @@
       <w:r>
         <w:drawing>
           <wp:inline distT="0" distB="0" distL="0" distR="0">
-            <wp:extent cx="2857500" cy="876300"/>
+            <wp:extent cx="2857500" cy="5029200"/>
             <wp:effectExtent t="0" r="0" b="0" l="0"/>
-            <wp:docPr id="1" name="g_favorito.jpg" descr="Estrela de favorito na página do ponto" title="Estrela de favorito na página do ponto"/>
+            <wp:docPr id="1" name="p1_form_cartao.jpg" descr="Cadastro de cartão de crédito no perfil" title="Cadastro de cartão de crédito no perfil"/>
             <wp:cNvGraphicFramePr>
               <a:graphicFrameLocks xmlns:a="http://schemas.openxmlformats.org/drawingml/2006/main" noChangeAspect="1"/>
             </wp:cNvGraphicFramePr>
@@ -4222,7 +4383,7 @@
                   <pic:spPr bwMode="auto">
                     <a:xfrm>
                       <a:off x="0" y="0"/>
-                      <a:ext cx="2857500" cy="876300"/>
+                      <a:ext cx="2857500" cy="5029200"/>
                     </a:xfrm>
                     <a:prstGeom prst="rect">
                       <a:avLst/>
@@ -4248,33 +4409,19 @@
           <w:sz w:val="18"/>
           <w:szCs w:val="18"/>
         </w:rPr>
-        <w:t xml:space="preserve">Figura 14 – Estrela de favorito na página do ponto</w:t>
-      </w:r>
-    </w:p>
-    <w:p>
-      <w:pPr>
-        <w:pStyle w:val="Heading1"/>
-      </w:pPr>
-      <w:r>
-        <w:t xml:space="preserve">12. Meu perfil</w:t>
-      </w:r>
-    </w:p>
-    <w:p>
-      <w:pPr>
-        <w:spacing w:after="120" w:line="300"/>
-      </w:pPr>
-      <w:r>
-        <w:t xml:space="preserve">Toque no seu </w:t>
-      </w:r>
-      <w:r>
-        <w:rPr>
-          <w:b/>
-          <w:bCs/>
-        </w:rPr>
-        <w:t xml:space="preserve">nome</w:t>
-      </w:r>
-      <w:r>
-        <w:t xml:space="preserve"> (ou na inicial em verde), no canto superior direito, para abrir o seu perfil. Nele você encontra:</w:t>
+        <w:t xml:space="preserve">Figura 14 – Cadastro de cartão de crédito no perfil</w:t>
+      </w:r>
+    </w:p>
+    <w:p>
+      <w:pPr>
+        <w:spacing w:after="60" w:before="120"/>
+      </w:pPr>
+      <w:r>
+        <w:rPr>
+          <w:b/>
+          <w:bCs/>
+        </w:rPr>
+        <w:t xml:space="preserve">Escolher a forma de pagamento:</w:t>
       </w:r>
     </w:p>
     <w:p>
@@ -4287,14 +4434,27 @@
         <w:spacing w:after="80" w:line="290"/>
       </w:pPr>
       <w:r>
-        <w:rPr>
-          <w:b/>
-          <w:bCs/>
-        </w:rPr>
-        <w:t xml:space="preserve">Recarga ativa</w:t>
-      </w:r>
-      <w:r>
-        <w:t xml:space="preserve">, com os botões para ver o ponto ou encerrar a recarga.</w:t>
+        <w:t xml:space="preserve">Ao tocar em </w:t>
+      </w:r>
+      <w:r>
+        <w:rPr>
+          <w:b/>
+          <w:bCs/>
+        </w:rPr>
+        <w:t xml:space="preserve">⚡ Iniciar recarga aqui</w:t>
+      </w:r>
+      <w:r>
+        <w:t xml:space="preserve">, o VoltMap pergunta </w:t>
+      </w:r>
+      <w:r>
+        <w:rPr>
+          <w:b/>
+          <w:bCs/>
+        </w:rPr>
+        <w:t xml:space="preserve">"Como você vai pagar?"</w:t>
+      </w:r>
+      <w:r>
+        <w:t xml:space="preserve">.</w:t>
       </w:r>
     </w:p>
     <w:p>
@@ -4307,14 +4467,37 @@
         <w:spacing w:after="80" w:line="290"/>
       </w:pPr>
       <w:r>
-        <w:rPr>
-          <w:b/>
-          <w:bCs/>
-        </w:rPr>
-        <w:t xml:space="preserve">Resumo</w:t>
-      </w:r>
-      <w:r>
-        <w:t xml:space="preserve">: quantos pontos você cadastrou, quantos favoritos tem e seus check-ins recentes.</w:t>
+        <w:t xml:space="preserve">Escolha um </w:t>
+      </w:r>
+      <w:r>
+        <w:rPr>
+          <w:b/>
+          <w:bCs/>
+        </w:rPr>
+        <w:t xml:space="preserve">cartão salvo</w:t>
+      </w:r>
+      <w:r>
+        <w:t xml:space="preserve"> ou </w:t>
+      </w:r>
+      <w:r>
+        <w:rPr>
+          <w:b/>
+          <w:bCs/>
+        </w:rPr>
+        <w:t xml:space="preserve">Pix</w:t>
+      </w:r>
+      <w:r>
+        <w:t xml:space="preserve"> (não precisa de cadastro) e toque em </w:t>
+      </w:r>
+      <w:r>
+        <w:rPr>
+          <w:b/>
+          <w:bCs/>
+        </w:rPr>
+        <w:t xml:space="preserve">⚡ Iniciar recarga</w:t>
+      </w:r>
+      <w:r>
+        <w:t xml:space="preserve">.</w:t>
       </w:r>
     </w:p>
     <w:p>
@@ -4327,34 +4510,27 @@
         <w:spacing w:after="80" w:line="290"/>
       </w:pPr>
       <w:r>
-        <w:rPr>
-          <w:b/>
-          <w:bCs/>
-        </w:rPr>
-        <w:t xml:space="preserve">Meus favoritos</w:t>
-      </w:r>
-      <w:r>
-        <w:t xml:space="preserve">, </w:t>
-      </w:r>
-      <w:r>
-        <w:rPr>
-          <w:b/>
-          <w:bCs/>
-        </w:rPr>
-        <w:t xml:space="preserve">Pontos que cadastrei</w:t>
-      </w:r>
-      <w:r>
-        <w:t xml:space="preserve"> e </w:t>
-      </w:r>
-      <w:r>
-        <w:rPr>
-          <w:b/>
-          <w:bCs/>
-        </w:rPr>
-        <w:t xml:space="preserve">Meus check-ins recentes</w:t>
-      </w:r>
-      <w:r>
-        <w:t xml:space="preserve">. Toque em qualquer item para abrir o ponto.</w:t>
+        <w:t xml:space="preserve">Ao encerrar a recarga, aparece o </w:t>
+      </w:r>
+      <w:r>
+        <w:rPr>
+          <w:b/>
+          <w:bCs/>
+        </w:rPr>
+        <w:t xml:space="preserve">resumo</w:t>
+      </w:r>
+      <w:r>
+        <w:t xml:space="preserve">: duração, energia estimada (kWh), preço de referência (R$ 2,00/kWh), forma de pagamento e o </w:t>
+      </w:r>
+      <w:r>
+        <w:rPr>
+          <w:b/>
+          <w:bCs/>
+        </w:rPr>
+        <w:t xml:space="preserve">total estimado</w:t>
+      </w:r>
+      <w:r>
+        <w:t xml:space="preserve">.</w:t>
       </w:r>
     </w:p>
     <w:p>
@@ -4367,44 +4543,27 @@
         <w:spacing w:after="80" w:line="290"/>
       </w:pPr>
       <w:r>
-        <w:rPr>
-          <w:b/>
-          <w:bCs/>
-        </w:rPr>
-        <w:t xml:space="preserve">Meus dados</w:t>
-      </w:r>
-      <w:r>
-        <w:t xml:space="preserve">: altere o seu nome e toque em </w:t>
-      </w:r>
-      <w:r>
-        <w:rPr>
-          <w:b/>
-          <w:bCs/>
-        </w:rPr>
-        <w:t xml:space="preserve">Salvar dados</w:t>
+        <w:t xml:space="preserve">Com cartão, a situação aparece como "Pagamento aprovado (simulação)". Com Pix, aparece um código </w:t>
+      </w:r>
+      <w:r>
+        <w:rPr>
+          <w:b/>
+          <w:bCs/>
+        </w:rPr>
+        <w:t xml:space="preserve">Pix copia e cola</w:t>
+      </w:r>
+      <w:r>
+        <w:t xml:space="preserve"> de demonstração, com o botão </w:t>
+      </w:r>
+      <w:r>
+        <w:rPr>
+          <w:b/>
+          <w:bCs/>
+        </w:rPr>
+        <w:t xml:space="preserve">Copiar código</w:t>
       </w:r>
       <w:r>
         <w:t xml:space="preserve">.</w:t>
-      </w:r>
-    </w:p>
-    <w:p>
-      <w:pPr>
-        <w:pStyle w:val="ListParagraph"/>
-        <w:numPr>
-          <w:ilvl w:val="0"/>
-          <w:numId w:val="14"/>
-        </w:numPr>
-        <w:spacing w:after="80" w:line="290"/>
-      </w:pPr>
-      <w:r>
-        <w:rPr>
-          <w:b/>
-          <w:bCs/>
-        </w:rPr>
-        <w:t xml:space="preserve">Alterar senha</w:t>
-      </w:r>
-      <w:r>
-        <w:t xml:space="preserve">: informe a senha atual e a nova senha duas vezes.</w:t>
       </w:r>
     </w:p>
     <w:p>
@@ -4417,9 +4576,9 @@
       <w:r>
         <w:drawing>
           <wp:inline distT="0" distB="0" distL="0" distR="0">
-            <wp:extent cx="2667000" cy="4543425"/>
+            <wp:extent cx="2667000" cy="3009900"/>
             <wp:effectExtent t="0" r="0" b="0" l="0"/>
-            <wp:docPr id="1" name="g_perfil.jpg" descr="Tela Meu perfil" title="Tela Meu perfil"/>
+            <wp:docPr id="1" name="p3_escolher.jpg" descr="Escolha da forma de pagamento ao iniciar a recarga" title="Escolha da forma de pagamento ao iniciar a recarga"/>
             <wp:cNvGraphicFramePr>
               <a:graphicFrameLocks xmlns:a="http://schemas.openxmlformats.org/drawingml/2006/main" noChangeAspect="1"/>
             </wp:cNvGraphicFramePr>
@@ -4442,7 +4601,7 @@
                   <pic:spPr bwMode="auto">
                     <a:xfrm>
                       <a:off x="0" y="0"/>
-                      <a:ext cx="2667000" cy="4543425"/>
+                      <a:ext cx="2667000" cy="3009900"/>
                     </a:xfrm>
                     <a:prstGeom prst="rect">
                       <a:avLst/>
@@ -4468,113 +4627,7 @@
           <w:sz w:val="18"/>
           <w:szCs w:val="18"/>
         </w:rPr>
-        <w:t xml:space="preserve">Figura 15 – Tela Meu perfil</w:t>
-      </w:r>
-    </w:p>
-    <w:p>
-      <w:pPr>
-        <w:pStyle w:val="Heading1"/>
-      </w:pPr>
-      <w:r>
-        <w:t xml:space="preserve">13. Sobre o VoltMap (versão)</w:t>
-      </w:r>
-    </w:p>
-    <w:p>
-      <w:pPr>
-        <w:spacing w:after="120" w:line="300"/>
-      </w:pPr>
-      <w:r>
-        <w:t xml:space="preserve">Toque no ícone </w:t>
-      </w:r>
-      <w:r>
-        <w:rPr>
-          <w:b/>
-          <w:bCs/>
-        </w:rPr>
-        <w:t xml:space="preserve">ⓘ</w:t>
-      </w:r>
-      <w:r>
-        <w:t xml:space="preserve">, no topo de qualquer tela, ou em </w:t>
-      </w:r>
-      <w:r>
-        <w:rPr>
-          <w:b/>
-          <w:bCs/>
-        </w:rPr>
-        <w:t xml:space="preserve">Sobre o VoltMap</w:t>
-      </w:r>
-      <w:r>
-        <w:t xml:space="preserve"> no perfil. A tela mostra:</w:t>
-      </w:r>
-    </w:p>
-    <w:p>
-      <w:pPr>
-        <w:pStyle w:val="ListParagraph"/>
-        <w:numPr>
-          <w:ilvl w:val="0"/>
-          <w:numId w:val="15"/>
-        </w:numPr>
-        <w:spacing w:after="80" w:line="290"/>
-      </w:pPr>
-      <w:r>
-        <w:rPr>
-          <w:b/>
-          <w:bCs/>
-        </w:rPr>
-        <w:t xml:space="preserve">Versão publicada</w:t>
-      </w:r>
-      <w:r>
-        <w:t xml:space="preserve">: número da versão, tag no GitHub, commit publicado, data em que a versão entrou no ar e ambiente.</w:t>
-      </w:r>
-    </w:p>
-    <w:p>
-      <w:pPr>
-        <w:pStyle w:val="ListParagraph"/>
-        <w:numPr>
-          <w:ilvl w:val="0"/>
-          <w:numId w:val="15"/>
-        </w:numPr>
-        <w:spacing w:after="80" w:line="290"/>
-      </w:pPr>
-      <w:r>
-        <w:rPr>
-          <w:b/>
-          <w:bCs/>
-        </w:rPr>
-        <w:t xml:space="preserve">Novidades da versão</w:t>
-      </w:r>
-      <w:r>
-        <w:t xml:space="preserve"> e </w:t>
-      </w:r>
-      <w:r>
-        <w:rPr>
-          <w:b/>
-          <w:bCs/>
-        </w:rPr>
-        <w:t xml:space="preserve">Próximas versões</w:t>
-      </w:r>
-      <w:r>
-        <w:t xml:space="preserve">.</w:t>
-      </w:r>
-    </w:p>
-    <w:p>
-      <w:pPr>
-        <w:pStyle w:val="ListParagraph"/>
-        <w:numPr>
-          <w:ilvl w:val="0"/>
-          <w:numId w:val="15"/>
-        </w:numPr>
-        <w:spacing w:after="80" w:line="290"/>
-      </w:pPr>
-      <w:r>
-        <w:rPr>
-          <w:b/>
-          <w:bCs/>
-        </w:rPr>
-        <w:t xml:space="preserve">Histórico de versões</w:t>
-      </w:r>
-      <w:r>
-        <w:t xml:space="preserve">: as últimas alterações do código, lidas diretamente do repositório no GitHub.</w:t>
+        <w:t xml:space="preserve">Figura 15 – Escolha da forma de pagamento ao iniciar a recarga</w:t>
       </w:r>
     </w:p>
     <w:p>
@@ -4587,9 +4640,9 @@
       <w:r>
         <w:drawing>
           <wp:inline distT="0" distB="0" distL="0" distR="0">
-            <wp:extent cx="2667000" cy="1600200"/>
+            <wp:extent cx="2667000" cy="2781300"/>
             <wp:effectExtent t="0" r="0" b="0" l="0"/>
-            <wp:docPr id="1" name="g_sobre.jpg" descr="Topo da tela Sobre o VoltMap" title="Topo da tela Sobre o VoltMap"/>
+            <wp:docPr id="1" name="p4_resumo_cartao.jpg" descr="Resumo da recarga paga com cartão" title="Resumo da recarga paga com cartão"/>
             <wp:cNvGraphicFramePr>
               <a:graphicFrameLocks xmlns:a="http://schemas.openxmlformats.org/drawingml/2006/main" noChangeAspect="1"/>
             </wp:cNvGraphicFramePr>
@@ -4612,6 +4665,585 @@
                   <pic:spPr bwMode="auto">
                     <a:xfrm>
                       <a:off x="0" y="0"/>
+                      <a:ext cx="2667000" cy="2781300"/>
+                    </a:xfrm>
+                    <a:prstGeom prst="rect">
+                      <a:avLst/>
+                    </a:prstGeom>
+                  </pic:spPr>
+                </pic:pic>
+              </a:graphicData>
+            </a:graphic>
+          </wp:inline>
+        </w:drawing>
+      </w:r>
+    </w:p>
+    <w:p>
+      <w:pPr>
+        <w:spacing w:after="240"/>
+        <w:jc w:val="center"/>
+      </w:pPr>
+      <w:r>
+        <w:rPr>
+          <w:i/>
+          <w:iCs/>
+          <w:color w:val="6B7280"/>
+          <w:sz w:val="18"/>
+          <w:szCs w:val="18"/>
+        </w:rPr>
+        <w:t xml:space="preserve">Figura 16 – Resumo da recarga paga com cartão</w:t>
+      </w:r>
+    </w:p>
+    <w:p>
+      <w:pPr>
+        <w:spacing w:after="120" w:line="300"/>
+      </w:pPr>
+      <w:r>
+        <w:t xml:space="preserve">Todas as recargas, com energia, valor e forma de pagamento, ficam em </w:t>
+      </w:r>
+      <w:r>
+        <w:rPr>
+          <w:b/>
+          <w:bCs/>
+        </w:rPr>
+        <w:t xml:space="preserve">Minhas recargas</w:t>
+      </w:r>
+      <w:r>
+        <w:t xml:space="preserve">, na tela Meu perfil.</w:t>
+      </w:r>
+    </w:p>
+    <w:p>
+      <w:pPr>
+        <w:pStyle w:val="Heading1"/>
+      </w:pPr>
+      <w:r>
+        <w:t xml:space="preserve">11. Favoritar pontos de recarga</w:t>
+      </w:r>
+    </w:p>
+    <w:p>
+      <w:pPr>
+        <w:pStyle w:val="ListParagraph"/>
+        <w:numPr>
+          <w:ilvl w:val="0"/>
+          <w:numId w:val="15"/>
+        </w:numPr>
+        <w:spacing w:after="80" w:line="290"/>
+      </w:pPr>
+      <w:r>
+        <w:t xml:space="preserve">Na página do ponto, toque na estrela </w:t>
+      </w:r>
+      <w:r>
+        <w:rPr>
+          <w:b/>
+          <w:bCs/>
+        </w:rPr>
+        <w:t xml:space="preserve">☆</w:t>
+      </w:r>
+      <w:r>
+        <w:t xml:space="preserve"> ao lado do status. Ela fica amarela (</w:t>
+      </w:r>
+      <w:r>
+        <w:rPr>
+          <w:b/>
+          <w:bCs/>
+        </w:rPr>
+        <w:t xml:space="preserve">★</w:t>
+      </w:r>
+      <w:r>
+        <w:t xml:space="preserve">) e o ponto é salvo nos seus favoritos.</w:t>
+      </w:r>
+    </w:p>
+    <w:p>
+      <w:pPr>
+        <w:pStyle w:val="ListParagraph"/>
+        <w:numPr>
+          <w:ilvl w:val="0"/>
+          <w:numId w:val="15"/>
+        </w:numPr>
+        <w:spacing w:after="80" w:line="290"/>
+      </w:pPr>
+      <w:r>
+        <w:t xml:space="preserve">Para remover, toque na estrela de novo.</w:t>
+      </w:r>
+    </w:p>
+    <w:p>
+      <w:pPr>
+        <w:pStyle w:val="ListParagraph"/>
+        <w:numPr>
+          <w:ilvl w:val="0"/>
+          <w:numId w:val="15"/>
+        </w:numPr>
+        <w:spacing w:after="80" w:line="290"/>
+      </w:pPr>
+      <w:r>
+        <w:t xml:space="preserve">Seus favoritos ficam em </w:t>
+      </w:r>
+      <w:r>
+        <w:rPr>
+          <w:b/>
+          <w:bCs/>
+        </w:rPr>
+        <w:t xml:space="preserve">Meu perfil</w:t>
+      </w:r>
+      <w:r>
+        <w:t xml:space="preserve"> (seção 12), para acesso rápido.</w:t>
+      </w:r>
+    </w:p>
+    <w:p>
+      <w:pPr>
+        <w:keepNext/>
+        <w:keepLines/>
+        <w:spacing w:after="60" w:before="160"/>
+        <w:jc w:val="center"/>
+      </w:pPr>
+      <w:r>
+        <w:drawing>
+          <wp:inline distT="0" distB="0" distL="0" distR="0">
+            <wp:extent cx="2857500" cy="876300"/>
+            <wp:effectExtent t="0" r="0" b="0" l="0"/>
+            <wp:docPr id="1" name="g_favorito.jpg" descr="Estrela de favorito na página do ponto" title="Estrela de favorito na página do ponto"/>
+            <wp:cNvGraphicFramePr>
+              <a:graphicFrameLocks xmlns:a="http://schemas.openxmlformats.org/drawingml/2006/main" noChangeAspect="1"/>
+            </wp:cNvGraphicFramePr>
+            <a:graphic xmlns:a="http://schemas.openxmlformats.org/drawingml/2006/main">
+              <a:graphicData uri="http://schemas.openxmlformats.org/drawingml/2006/picture">
+                <pic:pic xmlns:pic="http://schemas.openxmlformats.org/drawingml/2006/picture">
+                  <pic:nvPicPr>
+                    <pic:cNvPr id="0" name="" descr=""/>
+                    <pic:cNvPicPr>
+                      <a:picLocks noChangeAspect="1" noChangeArrowheads="1"/>
+                    </pic:cNvPicPr>
+                  </pic:nvPicPr>
+                  <pic:blipFill>
+                    <a:blip r:embed="rId24" cstate="none"/>
+                    <a:srcRect/>
+                    <a:stretch>
+                      <a:fillRect/>
+                    </a:stretch>
+                  </pic:blipFill>
+                  <pic:spPr bwMode="auto">
+                    <a:xfrm>
+                      <a:off x="0" y="0"/>
+                      <a:ext cx="2857500" cy="876300"/>
+                    </a:xfrm>
+                    <a:prstGeom prst="rect">
+                      <a:avLst/>
+                    </a:prstGeom>
+                  </pic:spPr>
+                </pic:pic>
+              </a:graphicData>
+            </a:graphic>
+          </wp:inline>
+        </w:drawing>
+      </w:r>
+    </w:p>
+    <w:p>
+      <w:pPr>
+        <w:spacing w:after="240"/>
+        <w:jc w:val="center"/>
+      </w:pPr>
+      <w:r>
+        <w:rPr>
+          <w:i/>
+          <w:iCs/>
+          <w:color w:val="6B7280"/>
+          <w:sz w:val="18"/>
+          <w:szCs w:val="18"/>
+        </w:rPr>
+        <w:t xml:space="preserve">Figura 17 – Estrela de favorito na página do ponto</w:t>
+      </w:r>
+    </w:p>
+    <w:p>
+      <w:pPr>
+        <w:pStyle w:val="Heading1"/>
+      </w:pPr>
+      <w:r>
+        <w:t xml:space="preserve">12. Meu perfil</w:t>
+      </w:r>
+    </w:p>
+    <w:p>
+      <w:pPr>
+        <w:spacing w:after="120" w:line="300"/>
+      </w:pPr>
+      <w:r>
+        <w:t xml:space="preserve">Toque no seu </w:t>
+      </w:r>
+      <w:r>
+        <w:rPr>
+          <w:b/>
+          <w:bCs/>
+        </w:rPr>
+        <w:t xml:space="preserve">nome</w:t>
+      </w:r>
+      <w:r>
+        <w:t xml:space="preserve"> (ou na inicial em verde), no canto superior direito, para abrir o seu perfil. Nele você encontra:</w:t>
+      </w:r>
+    </w:p>
+    <w:p>
+      <w:pPr>
+        <w:pStyle w:val="ListParagraph"/>
+        <w:numPr>
+          <w:ilvl w:val="0"/>
+          <w:numId w:val="16"/>
+        </w:numPr>
+        <w:spacing w:after="80" w:line="290"/>
+      </w:pPr>
+      <w:r>
+        <w:rPr>
+          <w:b/>
+          <w:bCs/>
+        </w:rPr>
+        <w:t xml:space="preserve">Recarga ativa</w:t>
+      </w:r>
+      <w:r>
+        <w:t xml:space="preserve">, com os botões para ver o ponto ou encerrar a recarga.</w:t>
+      </w:r>
+    </w:p>
+    <w:p>
+      <w:pPr>
+        <w:pStyle w:val="ListParagraph"/>
+        <w:numPr>
+          <w:ilvl w:val="0"/>
+          <w:numId w:val="16"/>
+        </w:numPr>
+        <w:spacing w:after="80" w:line="290"/>
+      </w:pPr>
+      <w:r>
+        <w:rPr>
+          <w:b/>
+          <w:bCs/>
+        </w:rPr>
+        <w:t xml:space="preserve">Minhas recargas</w:t>
+      </w:r>
+      <w:r>
+        <w:t xml:space="preserve"> (energia, valor estimado e forma de pagamento) e </w:t>
+      </w:r>
+      <w:r>
+        <w:rPr>
+          <w:b/>
+          <w:bCs/>
+        </w:rPr>
+        <w:t xml:space="preserve">Formas de pagamento</w:t>
+      </w:r>
+      <w:r>
+        <w:t xml:space="preserve"> (seção 10.1).</w:t>
+      </w:r>
+    </w:p>
+    <w:p>
+      <w:pPr>
+        <w:pStyle w:val="ListParagraph"/>
+        <w:numPr>
+          <w:ilvl w:val="0"/>
+          <w:numId w:val="16"/>
+        </w:numPr>
+        <w:spacing w:after="80" w:line="290"/>
+      </w:pPr>
+      <w:r>
+        <w:rPr>
+          <w:b/>
+          <w:bCs/>
+        </w:rPr>
+        <w:t xml:space="preserve">Resumo</w:t>
+      </w:r>
+      <w:r>
+        <w:t xml:space="preserve">: quantos pontos você cadastrou, quantos favoritos tem e seus check-ins recentes.</w:t>
+      </w:r>
+    </w:p>
+    <w:p>
+      <w:pPr>
+        <w:pStyle w:val="ListParagraph"/>
+        <w:numPr>
+          <w:ilvl w:val="0"/>
+          <w:numId w:val="16"/>
+        </w:numPr>
+        <w:spacing w:after="80" w:line="290"/>
+      </w:pPr>
+      <w:r>
+        <w:rPr>
+          <w:b/>
+          <w:bCs/>
+        </w:rPr>
+        <w:t xml:space="preserve">Meus favoritos</w:t>
+      </w:r>
+      <w:r>
+        <w:t xml:space="preserve">, </w:t>
+      </w:r>
+      <w:r>
+        <w:rPr>
+          <w:b/>
+          <w:bCs/>
+        </w:rPr>
+        <w:t xml:space="preserve">Pontos que cadastrei</w:t>
+      </w:r>
+      <w:r>
+        <w:t xml:space="preserve"> e </w:t>
+      </w:r>
+      <w:r>
+        <w:rPr>
+          <w:b/>
+          <w:bCs/>
+        </w:rPr>
+        <w:t xml:space="preserve">Meus check-ins recentes</w:t>
+      </w:r>
+      <w:r>
+        <w:t xml:space="preserve">. Toque em qualquer item para abrir o ponto.</w:t>
+      </w:r>
+    </w:p>
+    <w:p>
+      <w:pPr>
+        <w:pStyle w:val="ListParagraph"/>
+        <w:numPr>
+          <w:ilvl w:val="0"/>
+          <w:numId w:val="16"/>
+        </w:numPr>
+        <w:spacing w:after="80" w:line="290"/>
+      </w:pPr>
+      <w:r>
+        <w:rPr>
+          <w:b/>
+          <w:bCs/>
+        </w:rPr>
+        <w:t xml:space="preserve">Meus dados</w:t>
+      </w:r>
+      <w:r>
+        <w:t xml:space="preserve">: altere o seu nome e toque em </w:t>
+      </w:r>
+      <w:r>
+        <w:rPr>
+          <w:b/>
+          <w:bCs/>
+        </w:rPr>
+        <w:t xml:space="preserve">Salvar dados</w:t>
+      </w:r>
+      <w:r>
+        <w:t xml:space="preserve">.</w:t>
+      </w:r>
+    </w:p>
+    <w:p>
+      <w:pPr>
+        <w:pStyle w:val="ListParagraph"/>
+        <w:numPr>
+          <w:ilvl w:val="0"/>
+          <w:numId w:val="16"/>
+        </w:numPr>
+        <w:spacing w:after="80" w:line="290"/>
+      </w:pPr>
+      <w:r>
+        <w:rPr>
+          <w:b/>
+          <w:bCs/>
+        </w:rPr>
+        <w:t xml:space="preserve">Alterar senha</w:t>
+      </w:r>
+      <w:r>
+        <w:t xml:space="preserve">: informe a senha atual e a nova senha duas vezes.</w:t>
+      </w:r>
+    </w:p>
+    <w:p>
+      <w:pPr>
+        <w:keepNext/>
+        <w:keepLines/>
+        <w:spacing w:after="60" w:before="160"/>
+        <w:jc w:val="center"/>
+      </w:pPr>
+      <w:r>
+        <w:drawing>
+          <wp:inline distT="0" distB="0" distL="0" distR="0">
+            <wp:extent cx="2667000" cy="4543425"/>
+            <wp:effectExtent t="0" r="0" b="0" l="0"/>
+            <wp:docPr id="1" name="g_perfil.jpg" descr="Tela Meu perfil" title="Tela Meu perfil"/>
+            <wp:cNvGraphicFramePr>
+              <a:graphicFrameLocks xmlns:a="http://schemas.openxmlformats.org/drawingml/2006/main" noChangeAspect="1"/>
+            </wp:cNvGraphicFramePr>
+            <a:graphic xmlns:a="http://schemas.openxmlformats.org/drawingml/2006/main">
+              <a:graphicData uri="http://schemas.openxmlformats.org/drawingml/2006/picture">
+                <pic:pic xmlns:pic="http://schemas.openxmlformats.org/drawingml/2006/picture">
+                  <pic:nvPicPr>
+                    <pic:cNvPr id="0" name="" descr=""/>
+                    <pic:cNvPicPr>
+                      <a:picLocks noChangeAspect="1" noChangeArrowheads="1"/>
+                    </pic:cNvPicPr>
+                  </pic:nvPicPr>
+                  <pic:blipFill>
+                    <a:blip r:embed="rId25" cstate="none"/>
+                    <a:srcRect/>
+                    <a:stretch>
+                      <a:fillRect/>
+                    </a:stretch>
+                  </pic:blipFill>
+                  <pic:spPr bwMode="auto">
+                    <a:xfrm>
+                      <a:off x="0" y="0"/>
+                      <a:ext cx="2667000" cy="4543425"/>
+                    </a:xfrm>
+                    <a:prstGeom prst="rect">
+                      <a:avLst/>
+                    </a:prstGeom>
+                  </pic:spPr>
+                </pic:pic>
+              </a:graphicData>
+            </a:graphic>
+          </wp:inline>
+        </w:drawing>
+      </w:r>
+    </w:p>
+    <w:p>
+      <w:pPr>
+        <w:spacing w:after="240"/>
+        <w:jc w:val="center"/>
+      </w:pPr>
+      <w:r>
+        <w:rPr>
+          <w:i/>
+          <w:iCs/>
+          <w:color w:val="6B7280"/>
+          <w:sz w:val="18"/>
+          <w:szCs w:val="18"/>
+        </w:rPr>
+        <w:t xml:space="preserve">Figura 18 – Tela Meu perfil</w:t>
+      </w:r>
+    </w:p>
+    <w:p>
+      <w:pPr>
+        <w:pStyle w:val="Heading1"/>
+      </w:pPr>
+      <w:r>
+        <w:t xml:space="preserve">13. Sobre o VoltMap (versão)</w:t>
+      </w:r>
+    </w:p>
+    <w:p>
+      <w:pPr>
+        <w:spacing w:after="120" w:line="300"/>
+      </w:pPr>
+      <w:r>
+        <w:t xml:space="preserve">Toque no ícone </w:t>
+      </w:r>
+      <w:r>
+        <w:rPr>
+          <w:b/>
+          <w:bCs/>
+        </w:rPr>
+        <w:t xml:space="preserve">ⓘ</w:t>
+      </w:r>
+      <w:r>
+        <w:t xml:space="preserve">, no topo de qualquer tela, ou em </w:t>
+      </w:r>
+      <w:r>
+        <w:rPr>
+          <w:b/>
+          <w:bCs/>
+        </w:rPr>
+        <w:t xml:space="preserve">Sobre o VoltMap</w:t>
+      </w:r>
+      <w:r>
+        <w:t xml:space="preserve"> no perfil. A tela mostra:</w:t>
+      </w:r>
+    </w:p>
+    <w:p>
+      <w:pPr>
+        <w:pStyle w:val="ListParagraph"/>
+        <w:numPr>
+          <w:ilvl w:val="0"/>
+          <w:numId w:val="17"/>
+        </w:numPr>
+        <w:spacing w:after="80" w:line="290"/>
+      </w:pPr>
+      <w:r>
+        <w:rPr>
+          <w:b/>
+          <w:bCs/>
+        </w:rPr>
+        <w:t xml:space="preserve">Versão publicada</w:t>
+      </w:r>
+      <w:r>
+        <w:t xml:space="preserve">: número da versão, tag no GitHub, commit publicado, data em que a versão entrou no ar e ambiente.</w:t>
+      </w:r>
+    </w:p>
+    <w:p>
+      <w:pPr>
+        <w:pStyle w:val="ListParagraph"/>
+        <w:numPr>
+          <w:ilvl w:val="0"/>
+          <w:numId w:val="17"/>
+        </w:numPr>
+        <w:spacing w:after="80" w:line="290"/>
+      </w:pPr>
+      <w:r>
+        <w:rPr>
+          <w:b/>
+          <w:bCs/>
+        </w:rPr>
+        <w:t xml:space="preserve">Novidades da versão</w:t>
+      </w:r>
+      <w:r>
+        <w:t xml:space="preserve"> e </w:t>
+      </w:r>
+      <w:r>
+        <w:rPr>
+          <w:b/>
+          <w:bCs/>
+        </w:rPr>
+        <w:t xml:space="preserve">Próximas versões</w:t>
+      </w:r>
+      <w:r>
+        <w:t xml:space="preserve">.</w:t>
+      </w:r>
+    </w:p>
+    <w:p>
+      <w:pPr>
+        <w:pStyle w:val="ListParagraph"/>
+        <w:numPr>
+          <w:ilvl w:val="0"/>
+          <w:numId w:val="17"/>
+        </w:numPr>
+        <w:spacing w:after="80" w:line="290"/>
+      </w:pPr>
+      <w:r>
+        <w:rPr>
+          <w:b/>
+          <w:bCs/>
+        </w:rPr>
+        <w:t xml:space="preserve">Histórico de versões</w:t>
+      </w:r>
+      <w:r>
+        <w:t xml:space="preserve">: as últimas alterações do código, lidas diretamente do repositório no GitHub.</w:t>
+      </w:r>
+    </w:p>
+    <w:p>
+      <w:pPr>
+        <w:keepNext/>
+        <w:keepLines/>
+        <w:spacing w:after="60" w:before="160"/>
+        <w:jc w:val="center"/>
+      </w:pPr>
+      <w:r>
+        <w:drawing>
+          <wp:inline distT="0" distB="0" distL="0" distR="0">
+            <wp:extent cx="2667000" cy="1600200"/>
+            <wp:effectExtent t="0" r="0" b="0" l="0"/>
+            <wp:docPr id="1" name="g_sobre.jpg" descr="Topo da tela Sobre o VoltMap" title="Topo da tela Sobre o VoltMap"/>
+            <wp:cNvGraphicFramePr>
+              <a:graphicFrameLocks xmlns:a="http://schemas.openxmlformats.org/drawingml/2006/main" noChangeAspect="1"/>
+            </wp:cNvGraphicFramePr>
+            <a:graphic xmlns:a="http://schemas.openxmlformats.org/drawingml/2006/main">
+              <a:graphicData uri="http://schemas.openxmlformats.org/drawingml/2006/picture">
+                <pic:pic xmlns:pic="http://schemas.openxmlformats.org/drawingml/2006/picture">
+                  <pic:nvPicPr>
+                    <pic:cNvPr id="0" name="" descr=""/>
+                    <pic:cNvPicPr>
+                      <a:picLocks noChangeAspect="1" noChangeArrowheads="1"/>
+                    </pic:cNvPicPr>
+                  </pic:nvPicPr>
+                  <pic:blipFill>
+                    <a:blip r:embed="rId26" cstate="none"/>
+                    <a:srcRect/>
+                    <a:stretch>
+                      <a:fillRect/>
+                    </a:stretch>
+                  </pic:blipFill>
+                  <pic:spPr bwMode="auto">
+                    <a:xfrm>
+                      <a:off x="0" y="0"/>
                       <a:ext cx="2667000" cy="1600200"/>
                     </a:xfrm>
                     <a:prstGeom prst="rect">
@@ -4638,7 +5270,7 @@
           <w:sz w:val="18"/>
           <w:szCs w:val="18"/>
         </w:rPr>
-        <w:t xml:space="preserve">Figura 16 – Topo da tela Sobre o VoltMap</w:t>
+        <w:t xml:space="preserve">Figura 19 – Topo da tela Sobre o VoltMap</w:t>
       </w:r>
     </w:p>
     <w:p>
@@ -4654,7 +5286,7 @@
         <w:pStyle w:val="ListParagraph"/>
         <w:numPr>
           <w:ilvl w:val="0"/>
-          <w:numId w:val="16"/>
+          <w:numId w:val="18"/>
         </w:numPr>
         <w:spacing w:after="80" w:line="290"/>
       </w:pPr>
@@ -5410,6 +6042,18 @@
     </w:lvlOverride>
   </w:num>
   <w:num w:numId="16">
+    <w:abstractNumId w:val="2"/>
+    <w:lvlOverride w:ilvl="0">
+      <w:startOverride w:val="1"/>
+    </w:lvlOverride>
+  </w:num>
+  <w:num w:numId="17">
+    <w:abstractNumId w:val="2"/>
+    <w:lvlOverride w:ilvl="0">
+      <w:startOverride w:val="1"/>
+    </w:lvlOverride>
+  </w:num>
+  <w:num w:numId="18">
     <w:abstractNumId w:val="2"/>
     <w:lvlOverride w:ilvl="0">
       <w:startOverride w:val="1"/>

</xml_diff>